<commit_message>
Update onboarding doc + local settings allowlist
Build verified green (next build).

Co-Authored-By: Claude Opus 4.8 (1M context) <noreply@anthropic.com>
</commit_message>
<xml_diff>
--- a/docs/contextualization-onboarding-instructions.docx
+++ b/docs/contextualization-onboarding-instructions.docx
@@ -122,27 +122,13 @@
         <w:rPr>
           <w:lang w:val="en-US"/>
         </w:rPr>
-        <w:t>Let’s see how we understand the past.</w:t>
-      </w:r>
-    </w:p>
-    <w:p>
-      <w:pPr>
-        <w:rPr>
-          <w:lang w:val="en-US"/>
-        </w:rPr>
-      </w:pPr>
-    </w:p>
-    <w:p>
-      <w:pPr>
-        <w:rPr>
-          <w:lang w:val="en-US"/>
-        </w:rPr>
-      </w:pPr>
-      <w:r>
-        <w:rPr>
-          <w:lang w:val="en-US"/>
-        </w:rPr>
-        <w:t>Slide 3</w:t>
+        <w:t>Let’s see how we understand the past</w:t>
+      </w:r>
+      <w:r>
+        <w:rPr>
+          <w:lang w:val="en-US"/>
+        </w:rPr>
+        <w:t>.</w:t>
       </w:r>
     </w:p>
     <w:p>
@@ -159,7 +145,7 @@
           <w:iCs/>
           <w:lang w:val="en-US"/>
         </w:rPr>
-        <w:t>What</w:t>
+        <w:t xml:space="preserve">What </w:t>
       </w:r>
       <w:r>
         <w:rPr>
@@ -167,7 +153,7 @@
           <w:iCs/>
           <w:lang w:val="en-US"/>
         </w:rPr>
-        <w:t xml:space="preserve">’s </w:t>
+        <w:t>do you think is</w:t>
       </w:r>
       <w:r>
         <w:rPr>
@@ -175,23 +161,7 @@
           <w:iCs/>
           <w:lang w:val="en-US"/>
         </w:rPr>
-        <w:t>most important</w:t>
-      </w:r>
-      <w:r>
-        <w:rPr>
-          <w:i/>
-          <w:iCs/>
-          <w:lang w:val="en-US"/>
-        </w:rPr>
-        <w:t xml:space="preserve"> to understand the past</w:t>
-      </w:r>
-      <w:r>
-        <w:rPr>
-          <w:i/>
-          <w:iCs/>
-          <w:lang w:val="en-US"/>
-        </w:rPr>
-        <w:t>?</w:t>
+        <w:t xml:space="preserve"> the meaning of history?</w:t>
       </w:r>
     </w:p>
     <w:p>
@@ -206,7 +176,37 @@
         <w:rPr>
           <w:lang w:val="en-US"/>
         </w:rPr>
-        <w:t>[Rank]</w:t>
+        <w:t>(</w:t>
+      </w:r>
+      <w:r>
+        <w:rPr>
+          <w:lang w:val="en-US"/>
+        </w:rPr>
+        <w:t>Interactive to have them r</w:t>
+      </w:r>
+      <w:r>
+        <w:rPr>
+          <w:lang w:val="en-US"/>
+        </w:rPr>
+        <w:t>ank</w:t>
+      </w:r>
+      <w:r>
+        <w:rPr>
+          <w:lang w:val="en-US"/>
+        </w:rPr>
+        <w:t>, so numbered but allow them to move it or maybe drag it into different numbers</w:t>
+      </w:r>
+      <w:r>
+        <w:rPr>
+          <w:lang w:val="en-US"/>
+        </w:rPr>
+        <w:t>. Haptic response when they drop it or move it to a different number. No right or wrong here, just collecting opinions. Also let’s collect data on this.</w:t>
+      </w:r>
+      <w:r>
+        <w:rPr>
+          <w:lang w:val="en-US"/>
+        </w:rPr>
+        <w:t>)</w:t>
       </w:r>
     </w:p>
     <w:p>
@@ -220,12 +220,11 @@
           <w:lang w:val="en-US"/>
         </w:rPr>
       </w:pPr>
-      <w:commentRangeStart w:id="0"/>
-      <w:r>
-        <w:rPr>
-          <w:lang w:val="en-US"/>
-        </w:rPr>
-        <w:t>Names, dates, and events of what happened</w:t>
+      <w:r>
+        <w:rPr>
+          <w:lang w:val="en-US"/>
+        </w:rPr>
+        <w:t>Reconstruction and explanation of the past</w:t>
       </w:r>
     </w:p>
     <w:p>
@@ -243,7 +242,13 @@
         <w:rPr>
           <w:lang w:val="en-US"/>
         </w:rPr>
-        <w:t>Reconstruction and explanation of the past</w:t>
+        <w:t>What people remember</w:t>
+      </w:r>
+      <w:r>
+        <w:rPr>
+          <w:lang w:val="en-US"/>
+        </w:rPr>
+        <w:t xml:space="preserve"> about the past</w:t>
       </w:r>
     </w:p>
     <w:p>
@@ -261,7 +266,133 @@
         <w:rPr>
           <w:lang w:val="en-US"/>
         </w:rPr>
-        <w:t>What people remember</w:t>
+        <w:t>Names, dates, and events of what happened</w:t>
+      </w:r>
+    </w:p>
+    <w:p>
+      <w:pPr>
+        <w:rPr>
+          <w:lang w:val="en-US"/>
+        </w:rPr>
+      </w:pPr>
+    </w:p>
+    <w:p>
+      <w:pPr>
+        <w:rPr>
+          <w:lang w:val="en-US"/>
+        </w:rPr>
+      </w:pPr>
+      <w:r>
+        <w:rPr>
+          <w:lang w:val="en-US"/>
+        </w:rPr>
+        <w:t xml:space="preserve">Slide </w:t>
+      </w:r>
+      <w:r>
+        <w:rPr>
+          <w:lang w:val="en-US"/>
+        </w:rPr>
+        <w:t>3</w:t>
+      </w:r>
+    </w:p>
+    <w:p>
+      <w:pPr>
+        <w:rPr>
+          <w:lang w:val="en-US"/>
+        </w:rPr>
+      </w:pPr>
+      <w:r>
+        <w:rPr>
+          <w:lang w:val="en-US"/>
+        </w:rPr>
+        <w:t>Thanks for sharing what you think.</w:t>
+      </w:r>
+    </w:p>
+    <w:p>
+      <w:pPr>
+        <w:rPr>
+          <w:lang w:val="en-US"/>
+        </w:rPr>
+      </w:pPr>
+      <w:r>
+        <w:rPr>
+          <w:lang w:val="en-US"/>
+        </w:rPr>
+        <w:t>We might have different thoughts of the meaning of history…</w:t>
+      </w:r>
+    </w:p>
+    <w:p>
+      <w:pPr>
+        <w:rPr>
+          <w:lang w:val="en-US"/>
+        </w:rPr>
+      </w:pPr>
+      <w:r>
+        <w:rPr>
+          <w:lang w:val="en-US"/>
+        </w:rPr>
+        <w:t>but m</w:t>
+      </w:r>
+      <w:r>
+        <w:rPr>
+          <w:lang w:val="en-US"/>
+        </w:rPr>
+        <w:t xml:space="preserve">ost </w:t>
+      </w:r>
+      <w:r>
+        <w:rPr>
+          <w:lang w:val="en-US"/>
+        </w:rPr>
+        <w:t xml:space="preserve">people </w:t>
+      </w:r>
+      <w:r>
+        <w:rPr>
+          <w:lang w:val="en-US"/>
+        </w:rPr>
+        <w:t>learn</w:t>
+      </w:r>
+      <w:r>
+        <w:rPr>
+          <w:lang w:val="en-US"/>
+        </w:rPr>
+        <w:t>ed</w:t>
+      </w:r>
+      <w:r>
+        <w:rPr>
+          <w:lang w:val="en-US"/>
+        </w:rPr>
+        <w:t xml:space="preserve"> the past as</w:t>
+      </w:r>
+      <w:r>
+        <w:rPr>
+          <w:lang w:val="en-US"/>
+        </w:rPr>
+        <w:t xml:space="preserve"> </w:t>
+      </w:r>
+      <w:r>
+        <w:rPr>
+          <w:lang w:val="en-US"/>
+        </w:rPr>
+        <w:t xml:space="preserve">lists of </w:t>
+      </w:r>
+      <w:commentRangeStart w:id="0"/>
+      <w:r>
+        <w:rPr>
+          <w:lang w:val="en-US"/>
+        </w:rPr>
+        <w:t>people</w:t>
+      </w:r>
+      <w:r>
+        <w:rPr>
+          <w:lang w:val="en-US"/>
+        </w:rPr>
+        <w:t>, dates</w:t>
+      </w:r>
+      <w:r>
+        <w:rPr>
+          <w:lang w:val="en-US"/>
+        </w:rPr>
+        <w:t>, and events</w:t>
       </w:r>
       <w:commentRangeEnd w:id="0"/>
       <w:r>
@@ -273,112 +404,24 @@
         </w:rPr>
         <w:commentReference w:id="0"/>
       </w:r>
-    </w:p>
-    <w:p>
-      <w:pPr>
-        <w:rPr>
-          <w:lang w:val="en-US"/>
-        </w:rPr>
-      </w:pPr>
-    </w:p>
-    <w:p>
-      <w:pPr>
-        <w:rPr>
-          <w:lang w:val="en-US"/>
-        </w:rPr>
-      </w:pPr>
-      <w:r>
-        <w:rPr>
-          <w:lang w:val="en-US"/>
-        </w:rPr>
-        <w:t xml:space="preserve">Slide </w:t>
-      </w:r>
-      <w:r>
-        <w:rPr>
-          <w:lang w:val="en-US"/>
-        </w:rPr>
-        <w:t>4</w:t>
-      </w:r>
-    </w:p>
-    <w:p>
-      <w:pPr>
-        <w:rPr>
-          <w:lang w:val="en-US"/>
-        </w:rPr>
-      </w:pPr>
-      <w:r>
-        <w:rPr>
-          <w:lang w:val="en-US"/>
-        </w:rPr>
-        <w:t>Thanks for sharing what you think.</w:t>
-      </w:r>
-    </w:p>
-    <w:p>
-      <w:pPr>
-        <w:rPr>
-          <w:lang w:val="en-US"/>
-        </w:rPr>
-      </w:pPr>
-      <w:r>
-        <w:rPr>
-          <w:lang w:val="en-US"/>
-        </w:rPr>
-        <w:t xml:space="preserve">Most </w:t>
-      </w:r>
-      <w:r>
-        <w:rPr>
-          <w:lang w:val="en-US"/>
-        </w:rPr>
-        <w:t xml:space="preserve">people actually </w:t>
-      </w:r>
-      <w:r>
-        <w:rPr>
-          <w:lang w:val="en-US"/>
-        </w:rPr>
-        <w:t>learn</w:t>
-      </w:r>
-      <w:r>
-        <w:rPr>
-          <w:lang w:val="en-US"/>
-        </w:rPr>
-        <w:t>ed</w:t>
-      </w:r>
-      <w:r>
-        <w:rPr>
-          <w:lang w:val="en-US"/>
-        </w:rPr>
-        <w:t xml:space="preserve"> the past as</w:t>
-      </w:r>
-      <w:r>
-        <w:rPr>
-          <w:lang w:val="en-US"/>
-        </w:rPr>
-        <w:t xml:space="preserve"> </w:t>
-      </w:r>
-      <w:r>
-        <w:rPr>
-          <w:lang w:val="en-US"/>
-        </w:rPr>
-        <w:t xml:space="preserve">lists of </w:t>
-      </w:r>
-      <w:r>
-        <w:rPr>
-          <w:lang w:val="en-US"/>
-        </w:rPr>
-        <w:t>people</w:t>
-      </w:r>
-      <w:r>
-        <w:rPr>
-          <w:lang w:val="en-US"/>
-        </w:rPr>
-        <w:t xml:space="preserve">, </w:t>
+      <w:r>
+        <w:rPr>
+          <w:lang w:val="en-US"/>
+        </w:rPr>
+        <w:t xml:space="preserve">—perhaps </w:t>
+      </w:r>
+      <w:r>
+        <w:rPr>
+          <w:lang w:val="en-US"/>
+        </w:rPr>
+        <w:t xml:space="preserve">in the form of a </w:t>
       </w:r>
       <w:commentRangeStart w:id="1"/>
       <w:r>
         <w:rPr>
           <w:lang w:val="en-US"/>
         </w:rPr>
-        <w:t>dates</w:t>
+        <w:t>story</w:t>
       </w:r>
       <w:commentRangeEnd w:id="1"/>
       <w:r>
@@ -394,14 +437,284 @@
         <w:rPr>
           <w:lang w:val="en-US"/>
         </w:rPr>
-        <w:t xml:space="preserve">, and </w:t>
-      </w:r>
+        <w:t>.</w:t>
+      </w:r>
+      <w:r>
+        <w:rPr>
+          <w:lang w:val="en-US"/>
+        </w:rPr>
+        <w:t xml:space="preserve"> </w:t>
+      </w:r>
+    </w:p>
+    <w:p>
+      <w:pPr>
+        <w:rPr>
+          <w:lang w:val="en-US"/>
+        </w:rPr>
+      </w:pPr>
+    </w:p>
+    <w:p>
+      <w:pPr>
+        <w:rPr>
+          <w:lang w:val="en-US"/>
+        </w:rPr>
+      </w:pPr>
+      <w:r>
+        <w:rPr>
+          <w:lang w:val="en-US"/>
+        </w:rPr>
+        <w:t xml:space="preserve">Slide </w:t>
+      </w:r>
+      <w:r>
+        <w:rPr>
+          <w:lang w:val="en-US"/>
+        </w:rPr>
+        <w:t>4</w:t>
+      </w:r>
+    </w:p>
+    <w:p>
+      <w:pPr>
+        <w:rPr>
+          <w:lang w:val="en-US"/>
+        </w:rPr>
+      </w:pPr>
+      <w:r>
+        <w:rPr>
+          <w:lang w:val="en-US"/>
+        </w:rPr>
+        <w:t xml:space="preserve">But people, </w:t>
+      </w:r>
+      <w:r>
+        <w:rPr>
+          <w:lang w:val="en-US"/>
+        </w:rPr>
+        <w:t xml:space="preserve">dates, and events </w:t>
+      </w:r>
+      <w:r>
+        <w:rPr>
+          <w:lang w:val="en-US"/>
+        </w:rPr>
+        <w:t>are like fragments</w:t>
+      </w:r>
+      <w:r>
+        <w:rPr>
+          <w:lang w:val="en-US"/>
+        </w:rPr>
+        <w:t xml:space="preserve"> </w:t>
+      </w:r>
+      <w:r>
+        <w:rPr>
+          <w:lang w:val="en-US"/>
+        </w:rPr>
+        <w:t>(</w:t>
+      </w:r>
+      <w:r>
+        <w:rPr>
+          <w:lang w:val="en-US"/>
+        </w:rPr>
+        <w:t>text animation that make it seem fragmented, but not too much so it’s hard to read</w:t>
+      </w:r>
+      <w:r>
+        <w:rPr>
+          <w:lang w:val="en-US"/>
+        </w:rPr>
+        <w:t>)</w:t>
+      </w:r>
+      <w:r>
+        <w:rPr>
+          <w:lang w:val="en-US"/>
+        </w:rPr>
+        <w:t xml:space="preserve">. To understand the </w:t>
+      </w:r>
+      <w:r>
+        <w:rPr>
+          <w:lang w:val="en-US"/>
+        </w:rPr>
+        <w:t>past</w:t>
+      </w:r>
+      <w:r>
+        <w:rPr>
+          <w:lang w:val="en-US"/>
+        </w:rPr>
+        <w:t>, we need to</w:t>
+      </w:r>
+      <w:r>
+        <w:rPr>
+          <w:lang w:val="en-US"/>
+        </w:rPr>
+        <w:t xml:space="preserve"> </w:t>
+      </w:r>
+      <w:r>
+        <w:rPr>
+          <w:lang w:val="en-US"/>
+        </w:rPr>
+        <w:t>piece</w:t>
+      </w:r>
+      <w:r>
+        <w:rPr>
+          <w:lang w:val="en-US"/>
+        </w:rPr>
+        <w:t xml:space="preserve"> </w:t>
+      </w:r>
+      <w:r>
+        <w:rPr>
+          <w:lang w:val="en-US"/>
+        </w:rPr>
+        <w:t>those fragments</w:t>
+      </w:r>
+      <w:r>
+        <w:rPr>
+          <w:lang w:val="en-US"/>
+        </w:rPr>
+        <w:t xml:space="preserve"> </w:t>
+      </w:r>
+      <w:r>
+        <w:rPr>
+          <w:lang w:val="en-US"/>
+        </w:rPr>
+        <w:t>(</w:t>
+      </w:r>
+      <w:r>
+        <w:rPr>
+          <w:lang w:val="en-US"/>
+        </w:rPr>
+        <w:t>opposite animation to make the fragments come together</w:t>
+      </w:r>
+      <w:r>
+        <w:rPr>
+          <w:lang w:val="en-US"/>
+        </w:rPr>
+        <w:t xml:space="preserve">) </w:t>
+      </w:r>
+      <w:r>
+        <w:rPr>
+          <w:lang w:val="en-US"/>
+        </w:rPr>
+        <w:t>back</w:t>
+      </w:r>
+      <w:r>
+        <w:rPr>
+          <w:lang w:val="en-US"/>
+        </w:rPr>
+        <w:t xml:space="preserve"> into the </w:t>
+      </w:r>
+      <w:r>
+        <w:rPr>
+          <w:lang w:val="en-US"/>
+        </w:rPr>
+        <w:t>bigger</w:t>
+      </w:r>
+      <w:r>
+        <w:rPr>
+          <w:lang w:val="en-US"/>
+        </w:rPr>
+        <w:t xml:space="preserve"> </w:t>
+      </w:r>
+      <w:r>
+        <w:rPr>
+          <w:lang w:val="en-US"/>
+        </w:rPr>
+        <w:t>picture</w:t>
+      </w:r>
+      <w:r>
+        <w:rPr>
+          <w:lang w:val="en-US"/>
+        </w:rPr>
+        <w:t xml:space="preserve"> </w:t>
+      </w:r>
+      <w:r>
+        <w:rPr>
+          <w:lang w:val="en-US"/>
+        </w:rPr>
+        <w:t>(</w:t>
+      </w:r>
+      <w:r>
+        <w:rPr>
+          <w:lang w:val="en-US"/>
+        </w:rPr>
+        <w:t xml:space="preserve">make </w:t>
+      </w:r>
+      <w:r>
+        <w:rPr>
+          <w:lang w:val="en-US"/>
+        </w:rPr>
+        <w:t>“</w:t>
+      </w:r>
+      <w:r>
+        <w:rPr>
+          <w:lang w:val="en-US"/>
+        </w:rPr>
+        <w:t>bigger</w:t>
+      </w:r>
+      <w:r>
+        <w:rPr>
+          <w:lang w:val="en-US"/>
+        </w:rPr>
+        <w:t>”</w:t>
+      </w:r>
+      <w:r>
+        <w:rPr>
+          <w:lang w:val="en-US"/>
+        </w:rPr>
+        <w:t>, slightly bigger</w:t>
+      </w:r>
+      <w:r>
+        <w:rPr>
+          <w:lang w:val="en-US"/>
+        </w:rPr>
+        <w:t>)</w:t>
+      </w:r>
+      <w:r>
+        <w:rPr>
+          <w:lang w:val="en-US"/>
+        </w:rPr>
+        <w:t>.</w:t>
+      </w:r>
+    </w:p>
+    <w:p>
+      <w:pPr>
+        <w:rPr>
+          <w:lang w:val="en-US"/>
+        </w:rPr>
+      </w:pPr>
       <w:commentRangeStart w:id="2"/>
-      <w:r>
-        <w:rPr>
-          <w:lang w:val="en-US"/>
-        </w:rPr>
-        <w:t>events</w:t>
+      <w:commentRangeStart w:id="3"/>
+      <w:commentRangeStart w:id="4"/>
+      <w:r>
+        <w:rPr>
+          <w:lang w:val="en-US"/>
+        </w:rPr>
+        <w:t xml:space="preserve">That </w:t>
+      </w:r>
+      <w:r>
+        <w:rPr>
+          <w:lang w:val="en-US"/>
+        </w:rPr>
+        <w:t xml:space="preserve">bigger picture </w:t>
+      </w:r>
+      <w:r>
+        <w:rPr>
+          <w:lang w:val="en-US"/>
+        </w:rPr>
+        <w:t xml:space="preserve">connects the fragments to the </w:t>
+      </w:r>
+      <w:r>
+        <w:rPr>
+          <w:lang w:val="en-US"/>
+        </w:rPr>
+        <w:t>scene</w:t>
+      </w:r>
+      <w:r>
+        <w:rPr>
+          <w:lang w:val="en-US"/>
+        </w:rPr>
+        <w:t xml:space="preserve"> around it</w:t>
+      </w:r>
+      <w:r>
+        <w:rPr>
+          <w:lang w:val="en-US"/>
+        </w:rPr>
+        <w:t>, which could support or change the meaning of the fragments.</w:t>
       </w:r>
       <w:commentRangeEnd w:id="2"/>
       <w:r>
@@ -413,125 +726,6 @@
         </w:rPr>
         <w:commentReference w:id="2"/>
       </w:r>
-      <w:r>
-        <w:rPr>
-          <w:lang w:val="en-US"/>
-        </w:rPr>
-        <w:t>. Sometimes in the form of a story.</w:t>
-      </w:r>
-    </w:p>
-    <w:p>
-      <w:pPr>
-        <w:rPr>
-          <w:lang w:val="en-US"/>
-        </w:rPr>
-      </w:pPr>
-    </w:p>
-    <w:p>
-      <w:pPr>
-        <w:rPr>
-          <w:lang w:val="en-US"/>
-        </w:rPr>
-      </w:pPr>
-      <w:r>
-        <w:rPr>
-          <w:lang w:val="en-US"/>
-        </w:rPr>
-        <w:lastRenderedPageBreak/>
-        <w:t>Slide 5</w:t>
-      </w:r>
-    </w:p>
-    <w:p>
-      <w:pPr>
-        <w:rPr>
-          <w:lang w:val="en-US"/>
-        </w:rPr>
-      </w:pPr>
-      <w:r>
-        <w:rPr>
-          <w:lang w:val="en-US"/>
-        </w:rPr>
-        <w:t xml:space="preserve">But people, </w:t>
-      </w:r>
-      <w:r>
-        <w:rPr>
-          <w:lang w:val="en-US"/>
-        </w:rPr>
-        <w:t xml:space="preserve">dates, and events </w:t>
-      </w:r>
-      <w:r>
-        <w:rPr>
-          <w:lang w:val="en-US"/>
-        </w:rPr>
-        <w:t xml:space="preserve">are like </w:t>
-      </w:r>
-      <w:commentRangeStart w:id="3"/>
-      <w:r>
-        <w:rPr>
-          <w:lang w:val="en-US"/>
-        </w:rPr>
-        <w:t>fragments</w:t>
-      </w:r>
-      <w:r>
-        <w:rPr>
-          <w:lang w:val="en-US"/>
-        </w:rPr>
-        <w:t xml:space="preserve">. To understand the </w:t>
-      </w:r>
-      <w:r>
-        <w:rPr>
-          <w:lang w:val="en-US"/>
-        </w:rPr>
-        <w:t>past</w:t>
-      </w:r>
-      <w:r>
-        <w:rPr>
-          <w:lang w:val="en-US"/>
-        </w:rPr>
-        <w:t>, we need to</w:t>
-      </w:r>
-      <w:r>
-        <w:rPr>
-          <w:lang w:val="en-US"/>
-        </w:rPr>
-        <w:t xml:space="preserve"> fit </w:t>
-      </w:r>
-      <w:r>
-        <w:rPr>
-          <w:lang w:val="en-US"/>
-        </w:rPr>
-        <w:t>those fragments</w:t>
-      </w:r>
-      <w:r>
-        <w:rPr>
-          <w:lang w:val="en-US"/>
-        </w:rPr>
-        <w:t xml:space="preserve"> back</w:t>
-      </w:r>
-      <w:r>
-        <w:rPr>
-          <w:lang w:val="en-US"/>
-        </w:rPr>
-        <w:t xml:space="preserve"> into the </w:t>
-      </w:r>
-      <w:r>
-        <w:rPr>
-          <w:lang w:val="en-US"/>
-        </w:rPr>
-        <w:t>full</w:t>
-      </w:r>
-      <w:r>
-        <w:rPr>
-          <w:lang w:val="en-US"/>
-        </w:rPr>
-        <w:t xml:space="preserve"> picture</w:t>
-      </w:r>
-      <w:r>
-        <w:rPr>
-          <w:lang w:val="en-US"/>
-        </w:rPr>
-        <w:t>.</w:t>
-      </w:r>
       <w:commentRangeEnd w:id="3"/>
       <w:r>
         <w:rPr>
@@ -542,100 +736,6 @@
         </w:rPr>
         <w:commentReference w:id="3"/>
       </w:r>
-    </w:p>
-    <w:p>
-      <w:pPr>
-        <w:rPr>
-          <w:lang w:val="en-US"/>
-        </w:rPr>
-      </w:pPr>
-    </w:p>
-    <w:p>
-      <w:pPr>
-        <w:rPr>
-          <w:lang w:val="en-US"/>
-        </w:rPr>
-      </w:pPr>
-      <w:r>
-        <w:rPr>
-          <w:lang w:val="en-US"/>
-        </w:rPr>
-        <w:t xml:space="preserve">Slide </w:t>
-      </w:r>
-      <w:r>
-        <w:rPr>
-          <w:lang w:val="en-US"/>
-        </w:rPr>
-        <w:t>6</w:t>
-      </w:r>
-    </w:p>
-    <w:p>
-      <w:pPr>
-        <w:rPr>
-          <w:lang w:val="en-US"/>
-        </w:rPr>
-      </w:pPr>
-      <w:r>
-        <w:rPr>
-          <w:lang w:val="en-US"/>
-        </w:rPr>
-        <w:t>That’s how a historian thinks. T</w:t>
-      </w:r>
-      <w:r>
-        <w:rPr>
-          <w:lang w:val="en-US"/>
-        </w:rPr>
-        <w:t xml:space="preserve">o understand </w:t>
-      </w:r>
-      <w:r>
-        <w:rPr>
-          <w:lang w:val="en-US"/>
-        </w:rPr>
-        <w:t>the past</w:t>
-      </w:r>
-      <w:r>
-        <w:rPr>
-          <w:lang w:val="en-US"/>
-        </w:rPr>
-        <w:t xml:space="preserve">, </w:t>
-      </w:r>
-      <w:r>
-        <w:rPr>
-          <w:lang w:val="en-US"/>
-        </w:rPr>
-        <w:t xml:space="preserve">they </w:t>
-      </w:r>
-      <w:commentRangeStart w:id="4"/>
-      <w:r>
-        <w:rPr>
-          <w:lang w:val="en-US"/>
-        </w:rPr>
-        <w:t>first</w:t>
-      </w:r>
-      <w:r>
-        <w:rPr>
-          <w:lang w:val="en-US"/>
-        </w:rPr>
-        <w:t xml:space="preserve"> </w:t>
-      </w:r>
-      <w:r>
-        <w:rPr>
-          <w:lang w:val="en-US"/>
-        </w:rPr>
-        <w:t>reconstruct</w:t>
-      </w:r>
-      <w:r>
-        <w:rPr>
-          <w:lang w:val="en-US"/>
-        </w:rPr>
-        <w:t xml:space="preserve"> that picture—the </w:t>
-      </w:r>
-      <w:r>
-        <w:rPr>
-          <w:lang w:val="en-US"/>
-        </w:rPr>
-        <w:t>world</w:t>
-      </w:r>
       <w:commentRangeEnd w:id="4"/>
       <w:r>
         <w:rPr>
@@ -646,11 +746,121 @@
         </w:rPr>
         <w:commentReference w:id="4"/>
       </w:r>
-      <w:r>
-        <w:rPr>
-          <w:lang w:val="en-US"/>
-        </w:rPr>
-        <w:t xml:space="preserve"> we no longer live in</w:t>
+    </w:p>
+    <w:p>
+      <w:pPr>
+        <w:rPr>
+          <w:lang w:val="en-US"/>
+        </w:rPr>
+      </w:pPr>
+    </w:p>
+    <w:p>
+      <w:pPr>
+        <w:rPr>
+          <w:lang w:val="en-US"/>
+        </w:rPr>
+      </w:pPr>
+      <w:r>
+        <w:rPr>
+          <w:lang w:val="en-US"/>
+        </w:rPr>
+        <w:t xml:space="preserve">Slide </w:t>
+      </w:r>
+      <w:r>
+        <w:rPr>
+          <w:lang w:val="en-US"/>
+        </w:rPr>
+        <w:t>5</w:t>
+      </w:r>
+    </w:p>
+    <w:p>
+      <w:pPr>
+        <w:rPr>
+          <w:lang w:val="en-US"/>
+        </w:rPr>
+      </w:pPr>
+      <w:r>
+        <w:rPr>
+          <w:lang w:val="en-US"/>
+        </w:rPr>
+        <w:t>That’s how a historian thinks. T</w:t>
+      </w:r>
+      <w:r>
+        <w:rPr>
+          <w:lang w:val="en-US"/>
+        </w:rPr>
+        <w:t xml:space="preserve">o understand </w:t>
+      </w:r>
+      <w:r>
+        <w:rPr>
+          <w:lang w:val="en-US"/>
+        </w:rPr>
+        <w:t>the past</w:t>
+      </w:r>
+      <w:r>
+        <w:rPr>
+          <w:lang w:val="en-US"/>
+        </w:rPr>
+        <w:t xml:space="preserve">, </w:t>
+      </w:r>
+      <w:r>
+        <w:rPr>
+          <w:lang w:val="en-US"/>
+        </w:rPr>
+        <w:t xml:space="preserve">they </w:t>
+      </w:r>
+      <w:commentRangeStart w:id="5"/>
+      <w:r>
+        <w:rPr>
+          <w:lang w:val="en-US"/>
+        </w:rPr>
+        <w:t>first</w:t>
+      </w:r>
+      <w:r>
+        <w:rPr>
+          <w:lang w:val="en-US"/>
+        </w:rPr>
+        <w:t xml:space="preserve"> </w:t>
+      </w:r>
+      <w:r>
+        <w:rPr>
+          <w:lang w:val="en-US"/>
+        </w:rPr>
+        <w:t>reconstruct</w:t>
+      </w:r>
+      <w:r>
+        <w:rPr>
+          <w:lang w:val="en-US"/>
+        </w:rPr>
+        <w:t xml:space="preserve"> that picture—the </w:t>
+      </w:r>
+      <w:r>
+        <w:rPr>
+          <w:lang w:val="en-US"/>
+        </w:rPr>
+        <w:t>world</w:t>
+      </w:r>
+      <w:commentRangeEnd w:id="5"/>
+      <w:r>
+        <w:rPr>
+          <w:rStyle w:val="CommentReference"/>
+          <w:sz w:val="24"/>
+          <w:szCs w:val="24"/>
+          <w:lang w:val="en-US"/>
+        </w:rPr>
+        <w:commentReference w:id="5"/>
+      </w:r>
+      <w:r>
+        <w:rPr>
+          <w:lang w:val="en-US"/>
+        </w:rPr>
+        <w:t xml:space="preserve"> </w:t>
+      </w:r>
+      <w:r>
+        <w:rPr>
+          <w:lang w:val="en-US"/>
+        </w:rPr>
+        <w:t>around the people and events</w:t>
       </w:r>
       <w:r>
         <w:rPr>
@@ -665,6 +875,43 @@
           <w:lang w:val="en-US"/>
         </w:rPr>
       </w:pPr>
+      <w:r>
+        <w:rPr>
+          <w:lang w:val="en-US"/>
+        </w:rPr>
+        <w:t xml:space="preserve">That world is </w:t>
+      </w:r>
+      <w:r>
+        <w:rPr>
+          <w:lang w:val="en-US"/>
+        </w:rPr>
+        <w:t>what historians call:</w:t>
+      </w:r>
+      <w:r>
+        <w:rPr>
+          <w:lang w:val="en-US"/>
+        </w:rPr>
+        <w:t xml:space="preserve"> </w:t>
+      </w:r>
+      <w:r>
+        <w:rPr>
+          <w:lang w:val="en-US"/>
+        </w:rPr>
+        <w:t>C</w:t>
+      </w:r>
+      <w:r>
+        <w:rPr>
+          <w:lang w:val="en-US"/>
+        </w:rPr>
+        <w:t>ontext</w:t>
+      </w:r>
+    </w:p>
+    <w:p>
+      <w:pPr>
+        <w:rPr>
+          <w:lang w:val="en-US"/>
+        </w:rPr>
+      </w:pPr>
     </w:p>
     <w:p>
       <w:pPr>
@@ -682,6 +929,143 @@
         <w:rPr>
           <w:lang w:val="en-US"/>
         </w:rPr>
+        <w:t>6</w:t>
+      </w:r>
+    </w:p>
+    <w:p>
+      <w:pPr>
+        <w:rPr>
+          <w:lang w:val="en-US"/>
+        </w:rPr>
+      </w:pPr>
+      <w:r>
+        <w:rPr>
+          <w:lang w:val="en-US"/>
+        </w:rPr>
+        <w:t>Therefore,</w:t>
+      </w:r>
+      <w:r>
+        <w:rPr>
+          <w:lang w:val="en-US"/>
+        </w:rPr>
+        <w:t xml:space="preserve"> contextualising</w:t>
+      </w:r>
+      <w:r>
+        <w:rPr>
+          <w:lang w:val="en-US"/>
+        </w:rPr>
+        <w:t xml:space="preserve"> is…</w:t>
+      </w:r>
+    </w:p>
+    <w:p>
+      <w:pPr>
+        <w:rPr>
+          <w:lang w:val="en-US"/>
+        </w:rPr>
+      </w:pPr>
+      <w:r>
+        <w:rPr>
+          <w:lang w:val="en-US"/>
+        </w:rPr>
+        <w:t>Reconstructing</w:t>
+      </w:r>
+      <w:r>
+        <w:rPr>
+          <w:lang w:val="en-US"/>
+        </w:rPr>
+        <w:t xml:space="preserve"> a time and place in the</w:t>
+      </w:r>
+      <w:r>
+        <w:rPr>
+          <w:lang w:val="en-US"/>
+        </w:rPr>
+        <w:t xml:space="preserve"> past</w:t>
+      </w:r>
+      <w:r>
+        <w:rPr>
+          <w:lang w:val="en-US"/>
+        </w:rPr>
+        <w:t>…</w:t>
+      </w:r>
+    </w:p>
+    <w:p>
+      <w:pPr>
+        <w:rPr>
+          <w:lang w:val="en-US"/>
+        </w:rPr>
+      </w:pPr>
+      <w:r>
+        <w:rPr>
+          <w:lang w:val="en-US"/>
+        </w:rPr>
+        <w:t xml:space="preserve">then </w:t>
+      </w:r>
+      <w:r>
+        <w:rPr>
+          <w:lang w:val="en-US"/>
+        </w:rPr>
+        <w:t xml:space="preserve">using it </w:t>
+      </w:r>
+      <w:r>
+        <w:rPr>
+          <w:lang w:val="en-US"/>
+        </w:rPr>
+        <w:t>to understand</w:t>
+      </w:r>
+      <w:r>
+        <w:rPr>
+          <w:lang w:val="en-US"/>
+        </w:rPr>
+        <w:t xml:space="preserve"> </w:t>
+      </w:r>
+      <w:r>
+        <w:rPr>
+          <w:lang w:val="en-US"/>
+        </w:rPr>
+        <w:t xml:space="preserve">its </w:t>
+      </w:r>
+      <w:r>
+        <w:rPr>
+          <w:lang w:val="en-US"/>
+        </w:rPr>
+        <w:t>people and events</w:t>
+      </w:r>
+      <w:r>
+        <w:rPr>
+          <w:lang w:val="en-US"/>
+        </w:rPr>
+        <w:t>.</w:t>
+      </w:r>
+    </w:p>
+    <w:p>
+      <w:pPr>
+        <w:rPr>
+          <w:lang w:val="en-US"/>
+        </w:rPr>
+      </w:pPr>
+    </w:p>
+    <w:p>
+      <w:pPr>
+        <w:rPr>
+          <w:lang w:val="en-US"/>
+        </w:rPr>
+      </w:pPr>
+      <w:r>
+        <w:rPr>
+          <w:lang w:val="en-US"/>
+        </w:rPr>
+        <w:t>Slide</w:t>
+      </w:r>
+      <w:r>
+        <w:rPr>
+          <w:lang w:val="en-US"/>
+        </w:rPr>
+        <w:t xml:space="preserve"> </w:t>
+      </w:r>
+      <w:r>
+        <w:rPr>
+          <w:lang w:val="en-US"/>
+        </w:rPr>
         <w:t>7</w:t>
       </w:r>
     </w:p>
@@ -695,13 +1079,90 @@
         <w:rPr>
           <w:lang w:val="en-US"/>
         </w:rPr>
-        <w:t xml:space="preserve">That world is </w:t>
-      </w:r>
-      <w:r>
-        <w:rPr>
-          <w:lang w:val="en-US"/>
-        </w:rPr>
-        <w:t>what historians call:</w:t>
+        <w:t>So h</w:t>
+      </w:r>
+      <w:r>
+        <w:rPr>
+          <w:lang w:val="en-US"/>
+        </w:rPr>
+        <w:t xml:space="preserve">ow do we do </w:t>
+      </w:r>
+      <w:commentRangeStart w:id="6"/>
+      <w:r>
+        <w:rPr>
+          <w:lang w:val="en-US"/>
+        </w:rPr>
+        <w:t>it</w:t>
+      </w:r>
+      <w:commentRangeEnd w:id="6"/>
+      <w:r>
+        <w:rPr>
+          <w:rStyle w:val="CommentReference"/>
+          <w:sz w:val="24"/>
+          <w:szCs w:val="24"/>
+          <w:lang w:val="en-US"/>
+        </w:rPr>
+        <w:commentReference w:id="6"/>
+      </w:r>
+      <w:r>
+        <w:rPr>
+          <w:lang w:val="en-US"/>
+        </w:rPr>
+        <w:t>?</w:t>
+      </w:r>
+      <w:r>
+        <w:rPr>
+          <w:lang w:val="en-US"/>
+        </w:rPr>
+        <w:t>!</w:t>
+      </w:r>
+    </w:p>
+    <w:p>
+      <w:pPr>
+        <w:rPr>
+          <w:lang w:val="en-US"/>
+        </w:rPr>
+      </w:pPr>
+      <w:r>
+        <w:rPr>
+          <w:lang w:val="en-US"/>
+        </w:rPr>
+        <w:t>By</w:t>
+      </w:r>
+      <w:r>
+        <w:rPr>
+          <w:lang w:val="en-US"/>
+        </w:rPr>
+        <w:t>…</w:t>
+      </w:r>
+      <w:r>
+        <w:rPr>
+          <w:lang w:val="en-US"/>
+        </w:rPr>
+        <w:t xml:space="preserve"> asking the right </w:t>
+      </w:r>
+      <w:commentRangeStart w:id="7"/>
+      <w:r>
+        <w:rPr>
+          <w:lang w:val="en-US"/>
+        </w:rPr>
+        <w:t>questions</w:t>
+      </w:r>
+      <w:commentRangeEnd w:id="7"/>
+      <w:r>
+        <w:rPr>
+          <w:rStyle w:val="CommentReference"/>
+          <w:sz w:val="24"/>
+          <w:szCs w:val="24"/>
+          <w:lang w:val="en-US"/>
+        </w:rPr>
+        <w:commentReference w:id="7"/>
+      </w:r>
+      <w:r>
+        <w:rPr>
+          <w:lang w:val="en-US"/>
+        </w:rPr>
+        <w:t>.</w:t>
       </w:r>
       <w:r>
         <w:rPr>
@@ -713,43 +1174,19 @@
         <w:rPr>
           <w:lang w:val="en-US"/>
         </w:rPr>
-        <w:t>C</w:t>
-      </w:r>
-      <w:r>
-        <w:rPr>
-          <w:lang w:val="en-US"/>
-        </w:rPr>
-        <w:t>ontext</w:t>
-      </w:r>
-      <w:r>
-        <w:rPr>
-          <w:lang w:val="en-US"/>
-        </w:rPr>
-        <w:t xml:space="preserve"> (make this </w:t>
-      </w:r>
-      <w:r>
-        <w:rPr>
-          <w:lang w:val="en-US"/>
-        </w:rPr>
-        <w:t xml:space="preserve">particular CONTEXT </w:t>
-      </w:r>
-      <w:r>
-        <w:rPr>
-          <w:lang w:val="en-US"/>
-        </w:rPr>
-        <w:t>pop</w:t>
-      </w:r>
-      <w:r>
-        <w:rPr>
-          <w:lang w:val="en-US"/>
-        </w:rPr>
-        <w:t xml:space="preserve"> because it’s the first time its introduced</w:t>
-      </w:r>
-      <w:r>
-        <w:rPr>
-          <w:lang w:val="en-US"/>
-        </w:rPr>
-        <w:t>).</w:t>
+        <w:t>(B</w:t>
+      </w:r>
+      <w:r>
+        <w:rPr>
+          <w:lang w:val="en-US"/>
+        </w:rPr>
+        <w:t>lur the “asking the right questions. Have them tap</w:t>
+      </w:r>
+      <w:r>
+        <w:rPr>
+          <w:lang w:val="en-US"/>
+        </w:rPr>
+        <w:t>. Give a haptic response when they do)</w:t>
       </w:r>
     </w:p>
     <w:p>
@@ -788,26 +1225,38 @@
         <w:rPr>
           <w:lang w:val="en-US"/>
         </w:rPr>
-        <w:t>To reconstruct context</w:t>
-      </w:r>
-      <w:r>
-        <w:rPr>
-          <w:lang w:val="en-US"/>
-        </w:rPr>
-        <w:t>…</w:t>
-      </w:r>
-    </w:p>
-    <w:p>
-      <w:pPr>
-        <w:rPr>
-          <w:lang w:val="en-US"/>
-        </w:rPr>
-      </w:pPr>
-      <w:r>
-        <w:rPr>
-          <w:lang w:val="en-US"/>
-        </w:rPr>
-        <w:t>We</w:t>
+        <w:t>This is where Provenance comes in.</w:t>
+      </w:r>
+    </w:p>
+    <w:p>
+      <w:pPr>
+        <w:rPr>
+          <w:lang w:val="en-US"/>
+        </w:rPr>
+      </w:pPr>
+      <w:r>
+        <w:rPr>
+          <w:lang w:val="en-US"/>
+        </w:rPr>
+        <w:t>We use the P.A.S.T. framework</w:t>
+      </w:r>
+      <w:r>
+        <w:rPr>
+          <w:lang w:val="en-US"/>
+        </w:rPr>
+        <w:t xml:space="preserve"> (make sure to colour code to the same as we do for P.A.S.T. in all other sections)</w:t>
+      </w:r>
+      <w:r>
+        <w:rPr>
+          <w:lang w:val="en-US"/>
+        </w:rPr>
+        <w:t xml:space="preserve"> to </w:t>
+      </w:r>
+      <w:r>
+        <w:rPr>
+          <w:lang w:val="en-US"/>
+        </w:rPr>
+        <w:t>think about different lenses of context, then</w:t>
       </w:r>
       <w:r>
         <w:rPr>
@@ -819,13 +1268,32 @@
         <w:rPr>
           <w:lang w:val="en-US"/>
         </w:rPr>
-        <w:t xml:space="preserve">need to put people and events </w:t>
-      </w:r>
-      <w:r>
-        <w:rPr>
-          <w:lang w:val="en-US"/>
-        </w:rPr>
-        <w:t>in</w:t>
+        <w:t xml:space="preserve">ask questions </w:t>
+      </w:r>
+      <w:r>
+        <w:rPr>
+          <w:lang w:val="en-US"/>
+        </w:rPr>
+        <w:t>(</w:t>
+      </w:r>
+      <w:r>
+        <w:rPr>
+          <w:lang w:val="en-US"/>
+        </w:rPr>
+        <w:t xml:space="preserve">make </w:t>
+      </w:r>
+      <w:r>
+        <w:rPr>
+          <w:lang w:val="en-US"/>
+        </w:rPr>
+        <w:lastRenderedPageBreak/>
+        <w:t>sure to accentuate “ask questions”</w:t>
+      </w:r>
+      <w:r>
+        <w:rPr>
+          <w:lang w:val="en-US"/>
+        </w:rPr>
+        <w:t>)</w:t>
       </w:r>
       <w:r>
         <w:rPr>
@@ -837,275 +1305,439 @@
         <w:rPr>
           <w:lang w:val="en-US"/>
         </w:rPr>
+        <w:t>to</w:t>
+      </w:r>
+      <w:r>
+        <w:rPr>
+          <w:lang w:val="en-US"/>
+        </w:rPr>
+        <w:t xml:space="preserve"> reconstruct</w:t>
+      </w:r>
+      <w:r>
+        <w:rPr>
+          <w:lang w:val="en-US"/>
+        </w:rPr>
+        <w:t xml:space="preserve"> </w:t>
+      </w:r>
+      <w:r>
+        <w:rPr>
+          <w:lang w:val="en-US"/>
+        </w:rPr>
+        <w:t xml:space="preserve">(again animate “reconstruct”) </w:t>
+      </w:r>
+      <w:r>
+        <w:rPr>
+          <w:lang w:val="en-US"/>
+        </w:rPr>
         <w:t xml:space="preserve">the </w:t>
       </w:r>
       <w:r>
+        <w:rPr>
+          <w:lang w:val="en-US"/>
+        </w:rPr>
+        <w:t>world.</w:t>
+      </w:r>
+    </w:p>
+    <w:p>
+      <w:pPr>
         <w:rPr>
           <w:b/>
           <w:bCs/>
           <w:lang w:val="en-US"/>
         </w:rPr>
-        <w:t>conditions</w:t>
-      </w:r>
-      <w:r>
-        <w:rPr>
-          <w:lang w:val="en-US"/>
-        </w:rPr>
-        <w:t xml:space="preserve"> of</w:t>
-      </w:r>
-      <w:r>
-        <w:rPr>
-          <w:lang w:val="en-US"/>
-        </w:rPr>
-        <w:t xml:space="preserve"> their OWN</w:t>
-      </w:r>
-      <w:r>
-        <w:rPr>
-          <w:lang w:val="en-US"/>
-        </w:rPr>
-        <w:t xml:space="preserve"> </w:t>
-      </w:r>
-      <w:r>
-        <w:rPr>
-          <w:lang w:val="en-US"/>
-        </w:rPr>
-        <w:t>time</w:t>
-      </w:r>
-      <w:r>
-        <w:rPr>
-          <w:lang w:val="en-US"/>
-        </w:rPr>
-        <w:t>.</w:t>
-      </w:r>
-    </w:p>
-    <w:p>
-      <w:pPr>
-        <w:rPr>
-          <w:lang w:val="en-US"/>
-        </w:rPr>
-      </w:pPr>
-    </w:p>
-    <w:p>
-      <w:pPr>
-        <w:rPr>
-          <w:lang w:val="en-US"/>
-        </w:rPr>
-      </w:pPr>
-      <w:r>
-        <w:rPr>
-          <w:lang w:val="en-US"/>
-        </w:rPr>
-        <w:t>Slide</w:t>
-      </w:r>
-      <w:r>
-        <w:rPr>
-          <w:lang w:val="en-US"/>
-        </w:rPr>
-        <w:t xml:space="preserve"> 9</w:t>
-      </w:r>
-    </w:p>
-    <w:p>
-      <w:pPr>
-        <w:rPr>
-          <w:b/>
-          <w:bCs/>
-          <w:lang w:val="en-US"/>
-        </w:rPr>
-      </w:pPr>
-      <w:r>
-        <w:rPr>
-          <w:b/>
-          <w:bCs/>
-          <w:lang w:val="en-US"/>
-        </w:rPr>
-        <w:t>So h</w:t>
-      </w:r>
-      <w:r>
-        <w:rPr>
-          <w:b/>
-          <w:bCs/>
-          <w:lang w:val="en-US"/>
-        </w:rPr>
-        <w:t>ow do we do it?</w:t>
-      </w:r>
-      <w:r>
-        <w:rPr>
-          <w:b/>
-          <w:bCs/>
-          <w:lang w:val="en-US"/>
-        </w:rPr>
-        <w:t>!</w:t>
-      </w:r>
-    </w:p>
-    <w:p>
-      <w:pPr>
-        <w:rPr>
-          <w:b/>
-          <w:bCs/>
-          <w:lang w:val="en-US"/>
-        </w:rPr>
-      </w:pPr>
-      <w:commentRangeStart w:id="5"/>
-      <w:r>
-        <w:rPr>
-          <w:b/>
-          <w:bCs/>
-          <w:lang w:val="en-US"/>
-        </w:rPr>
-        <w:t>By asking the right questions.</w:t>
-      </w:r>
-      <w:commentRangeEnd w:id="5"/>
+      </w:pPr>
+    </w:p>
+    <w:p>
+      <w:pPr>
+        <w:rPr>
+          <w:lang w:val="en-US"/>
+        </w:rPr>
+      </w:pPr>
+      <w:r>
+        <w:rPr>
+          <w:lang w:val="en-US"/>
+        </w:rPr>
+        <w:t xml:space="preserve">Slide </w:t>
+      </w:r>
+      <w:r>
+        <w:rPr>
+          <w:lang w:val="en-US"/>
+        </w:rPr>
+        <w:t>9</w:t>
+      </w:r>
+    </w:p>
+    <w:p>
+      <w:pPr>
+        <w:rPr>
+          <w:lang w:val="en-US"/>
+        </w:rPr>
+      </w:pPr>
+      <w:r>
+        <w:rPr>
+          <w:lang w:val="en-US"/>
+        </w:rPr>
+        <w:t>Here’s</w:t>
+      </w:r>
+      <w:r>
+        <w:rPr>
+          <w:lang w:val="en-US"/>
+        </w:rPr>
+        <w:t xml:space="preserve"> the </w:t>
+      </w:r>
+      <w:r>
+        <w:rPr>
+          <w:lang w:val="en-US"/>
+        </w:rPr>
+        <w:t xml:space="preserve">lenses of the </w:t>
+      </w:r>
+      <w:r>
+        <w:rPr>
+          <w:lang w:val="en-US"/>
+        </w:rPr>
+        <w:t>P.A.S.T.</w:t>
+      </w:r>
+      <w:r>
+        <w:rPr>
+          <w:lang w:val="en-US"/>
+        </w:rPr>
+        <w:t xml:space="preserve"> to </w:t>
+      </w:r>
+      <w:r>
+        <w:rPr>
+          <w:lang w:val="en-US"/>
+        </w:rPr>
+        <w:t>help frame</w:t>
+      </w:r>
+      <w:r>
+        <w:rPr>
+          <w:lang w:val="en-US"/>
+        </w:rPr>
+        <w:t xml:space="preserve"> your questions.</w:t>
+      </w:r>
+    </w:p>
+    <w:p>
+      <w:pPr>
+        <w:numPr>
+          <w:ilvl w:val="0"/>
+          <w:numId w:val="4"/>
+        </w:numPr>
+        <w:rPr>
+          <w:lang w:val="en-US"/>
+        </w:rPr>
+      </w:pPr>
+      <w:r>
+        <w:rPr>
+          <w:lang w:val="en-US"/>
+        </w:rPr>
+        <w:t>Place - Geography | Natural resources | Climate</w:t>
+      </w:r>
+    </w:p>
+    <w:p>
+      <w:pPr>
+        <w:numPr>
+          <w:ilvl w:val="1"/>
+          <w:numId w:val="5"/>
+        </w:numPr>
+        <w:rPr>
+          <w:i/>
+          <w:iCs/>
+          <w:lang w:val="en-US"/>
+        </w:rPr>
+      </w:pPr>
+      <w:r>
+        <w:rPr>
+          <w:i/>
+          <w:iCs/>
+          <w:lang w:val="en-US"/>
+        </w:rPr>
+        <w:t>What resources were important in the area? Why did a river change where people settled? [specific question] How did changes in seasonal rainfall affect trade patterns around the year?</w:t>
+      </w:r>
+    </w:p>
+    <w:p>
+      <w:pPr>
+        <w:numPr>
+          <w:ilvl w:val="0"/>
+          <w:numId w:val="4"/>
+        </w:numPr>
+        <w:rPr>
+          <w:lang w:val="en-US"/>
+        </w:rPr>
+      </w:pPr>
+      <w:r>
+        <w:rPr>
+          <w:lang w:val="en-US"/>
+        </w:rPr>
+        <w:t>Affairs - Relevant Events of the Time | Natural Disasters</w:t>
+      </w:r>
+    </w:p>
+    <w:p>
+      <w:pPr>
+        <w:numPr>
+          <w:ilvl w:val="1"/>
+          <w:numId w:val="6"/>
+        </w:numPr>
+        <w:rPr>
+          <w:i/>
+          <w:iCs/>
+          <w:lang w:val="en-US"/>
+        </w:rPr>
+      </w:pPr>
+      <w:r>
+        <w:rPr>
+          <w:i/>
+          <w:iCs/>
+          <w:lang w:val="en-US"/>
+        </w:rPr>
+        <w:t>How did an election affect policy decisions? [specific question] How did COVID-19 change public opinion?</w:t>
+      </w:r>
+    </w:p>
+    <w:p>
+      <w:pPr>
+        <w:numPr>
+          <w:ilvl w:val="0"/>
+          <w:numId w:val="4"/>
+        </w:numPr>
+        <w:rPr>
+          <w:lang w:val="en-US"/>
+        </w:rPr>
+      </w:pPr>
+      <w:r>
+        <w:rPr>
+          <w:lang w:val="en-US"/>
+        </w:rPr>
+        <w:t>Society - Cultural Values | Social Class | Political System | Economy</w:t>
+      </w:r>
+    </w:p>
+    <w:p>
+      <w:pPr>
+        <w:numPr>
+          <w:ilvl w:val="1"/>
+          <w:numId w:val="7"/>
+        </w:numPr>
+        <w:rPr>
+          <w:i/>
+          <w:iCs/>
+          <w:lang w:val="en-US"/>
+        </w:rPr>
+      </w:pPr>
+      <w:r>
+        <w:rPr>
+          <w:i/>
+          <w:iCs/>
+          <w:lang w:val="en-US"/>
+        </w:rPr>
+        <w:t>Who held power? Were there changing ideologies? What were the economic conditions of the time? [specific question] How did Christianity influence social class in colonial New England? [specific question] How did Darwin’s theory of evolution expand the scientific community?</w:t>
+      </w:r>
+    </w:p>
+    <w:p>
+      <w:pPr>
+        <w:numPr>
+          <w:ilvl w:val="0"/>
+          <w:numId w:val="4"/>
+        </w:numPr>
+        <w:rPr>
+          <w:lang w:val="en-US"/>
+        </w:rPr>
+      </w:pPr>
+      <w:r>
+        <w:rPr>
+          <w:lang w:val="en-US"/>
+        </w:rPr>
+        <w:t>Technology - Useful tools | Infrastructure | Key Inventions</w:t>
+      </w:r>
+    </w:p>
+    <w:p>
+      <w:pPr>
+        <w:numPr>
+          <w:ilvl w:val="1"/>
+          <w:numId w:val="8"/>
+        </w:numPr>
+        <w:rPr>
+          <w:i/>
+          <w:iCs/>
+          <w:lang w:val="en-US"/>
+        </w:rPr>
+      </w:pPr>
+      <w:r>
+        <w:rPr>
+          <w:i/>
+          <w:iCs/>
+          <w:lang w:val="en-US"/>
+        </w:rPr>
+        <w:t>Were there important new inventions? How did a new invention change daily life? [specific question] How did the railroads affect migration?</w:t>
+      </w:r>
+    </w:p>
+    <w:p>
+      <w:pPr>
+        <w:rPr>
+          <w:lang w:val="en-US"/>
+        </w:rPr>
+      </w:pPr>
+    </w:p>
+    <w:p>
+      <w:pPr>
+        <w:rPr>
+          <w:lang w:val="en-US"/>
+        </w:rPr>
+      </w:pPr>
+      <w:r>
+        <w:rPr>
+          <w:lang w:val="en-US"/>
+        </w:rPr>
+        <w:t>Slide 10</w:t>
+      </w:r>
+    </w:p>
+    <w:p>
+      <w:pPr>
+        <w:rPr>
+          <w:lang w:val="en-US"/>
+        </w:rPr>
+      </w:pPr>
+      <w:r>
+        <w:rPr>
+          <w:lang w:val="en-US"/>
+        </w:rPr>
+        <w:t>Contextualising is important because it helps us…</w:t>
+      </w:r>
+    </w:p>
+    <w:p>
+      <w:pPr>
+        <w:rPr>
+          <w:lang w:val="en-US"/>
+        </w:rPr>
+      </w:pPr>
+      <w:r>
+        <w:rPr>
+          <w:lang w:val="en-US"/>
+        </w:rPr>
+        <w:tab/>
+        <w:t>(Fade in and reveal one at a time)</w:t>
+      </w:r>
+    </w:p>
+    <w:p>
+      <w:pPr>
+        <w:pStyle w:val="ListParagraph"/>
+        <w:numPr>
+          <w:ilvl w:val="0"/>
+          <w:numId w:val="3"/>
+        </w:numPr>
+        <w:rPr>
+          <w:lang w:val="en-US"/>
+        </w:rPr>
+      </w:pPr>
+      <w:commentRangeStart w:id="8"/>
+      <w:r>
+        <w:rPr>
+          <w:lang w:val="en-US"/>
+        </w:rPr>
+        <w:t>Q</w:t>
+      </w:r>
+      <w:r>
+        <w:rPr>
+          <w:lang w:val="en-US"/>
+        </w:rPr>
+        <w:t xml:space="preserve">uestion </w:t>
+      </w:r>
+      <w:commentRangeEnd w:id="8"/>
       <w:r>
         <w:rPr>
           <w:rStyle w:val="CommentReference"/>
-          <w:b/>
-          <w:bCs/>
           <w:sz w:val="24"/>
           <w:szCs w:val="24"/>
           <w:lang w:val="en-US"/>
         </w:rPr>
-        <w:commentReference w:id="5"/>
-      </w:r>
-    </w:p>
-    <w:p>
-      <w:pPr>
-        <w:rPr>
-          <w:b/>
-          <w:bCs/>
-          <w:lang w:val="en-US"/>
-        </w:rPr>
-      </w:pPr>
-    </w:p>
-    <w:p>
-      <w:pPr>
-        <w:rPr>
-          <w:b/>
-          <w:bCs/>
-          <w:lang w:val="en-US"/>
-        </w:rPr>
-      </w:pPr>
-      <w:r>
-        <w:rPr>
-          <w:b/>
-          <w:bCs/>
-          <w:lang w:val="en-US"/>
-        </w:rPr>
-        <w:t>Slide 10</w:t>
-      </w:r>
-    </w:p>
-    <w:p>
-      <w:pPr>
-        <w:rPr>
-          <w:b/>
-          <w:bCs/>
-          <w:lang w:val="en-US"/>
-        </w:rPr>
-      </w:pPr>
-      <w:r>
-        <w:rPr>
-          <w:b/>
-          <w:bCs/>
-          <w:lang w:val="en-US"/>
-        </w:rPr>
-        <w:t>This is where Provenance comes in.</w:t>
-      </w:r>
-    </w:p>
-    <w:p>
-      <w:pPr>
-        <w:rPr>
-          <w:b/>
-          <w:bCs/>
-          <w:lang w:val="en-US"/>
-        </w:rPr>
-      </w:pPr>
-      <w:r>
-        <w:rPr>
-          <w:b/>
-          <w:bCs/>
-          <w:lang w:val="en-US"/>
-        </w:rPr>
-        <w:t xml:space="preserve">We use the P.A.S.T. framework to help you </w:t>
-      </w:r>
-      <w:r>
-        <w:rPr>
-          <w:b/>
-          <w:bCs/>
-          <w:lang w:val="en-US"/>
-        </w:rPr>
-        <w:t>ask the right questions and</w:t>
-      </w:r>
-      <w:r>
-        <w:rPr>
-          <w:b/>
-          <w:bCs/>
-          <w:lang w:val="en-US"/>
-        </w:rPr>
-        <w:t xml:space="preserve"> reconstruct the context.</w:t>
-      </w:r>
-    </w:p>
-    <w:p>
-      <w:pPr>
-        <w:rPr>
-          <w:b/>
-          <w:bCs/>
-          <w:lang w:val="en-US"/>
-        </w:rPr>
-      </w:pPr>
-    </w:p>
-    <w:p>
-      <w:pPr>
-        <w:rPr>
-          <w:lang w:val="en-US"/>
-        </w:rPr>
-      </w:pPr>
-      <w:r>
-        <w:rPr>
-          <w:lang w:val="en-US"/>
-        </w:rPr>
-        <w:t>Slide 11</w:t>
-      </w:r>
-    </w:p>
-    <w:p>
-      <w:pPr>
-        <w:rPr>
-          <w:lang w:val="en-US"/>
-        </w:rPr>
-      </w:pPr>
-      <w:r>
-        <w:rPr>
-          <w:lang w:val="en-US"/>
-        </w:rPr>
-        <w:t>Here’s</w:t>
-      </w:r>
-      <w:r>
-        <w:rPr>
-          <w:lang w:val="en-US"/>
-        </w:rPr>
-        <w:t xml:space="preserve"> the </w:t>
-      </w:r>
-      <w:r>
-        <w:rPr>
-          <w:lang w:val="en-US"/>
-        </w:rPr>
-        <w:t>P.A.S.T.</w:t>
-      </w:r>
-      <w:r>
-        <w:rPr>
-          <w:lang w:val="en-US"/>
-        </w:rPr>
-        <w:t xml:space="preserve"> to </w:t>
-      </w:r>
-      <w:r>
-        <w:rPr>
-          <w:lang w:val="en-US"/>
-        </w:rPr>
-        <w:t>frame</w:t>
-      </w:r>
-      <w:r>
-        <w:rPr>
-          <w:lang w:val="en-US"/>
-        </w:rPr>
-        <w:t xml:space="preserve"> your questions.</w:t>
+        <w:commentReference w:id="8"/>
+      </w:r>
+      <w:r>
+        <w:rPr>
+          <w:lang w:val="en-US"/>
+        </w:rPr>
+        <w:t xml:space="preserve">and see </w:t>
+      </w:r>
+      <w:r>
+        <w:rPr>
+          <w:lang w:val="en-US"/>
+        </w:rPr>
+        <w:t>past what is in front of us.</w:t>
+      </w:r>
+    </w:p>
+    <w:p>
+      <w:pPr>
+        <w:pStyle w:val="ListParagraph"/>
+        <w:numPr>
+          <w:ilvl w:val="0"/>
+          <w:numId w:val="3"/>
+        </w:numPr>
+        <w:rPr>
+          <w:lang w:val="en-US"/>
+        </w:rPr>
+      </w:pPr>
+      <w:r>
+        <w:rPr>
+          <w:lang w:val="en-US"/>
+        </w:rPr>
+        <w:t>Connect better to the past.</w:t>
+      </w:r>
+    </w:p>
+    <w:p>
+      <w:pPr>
+        <w:pStyle w:val="ListParagraph"/>
+        <w:numPr>
+          <w:ilvl w:val="0"/>
+          <w:numId w:val="3"/>
+        </w:numPr>
+        <w:rPr>
+          <w:lang w:val="en-US"/>
+        </w:rPr>
+      </w:pPr>
+      <w:r>
+        <w:rPr>
+          <w:lang w:val="en-US"/>
+        </w:rPr>
+        <w:t>Map out the past from one place to another using context!</w:t>
+      </w:r>
+    </w:p>
+    <w:p>
+      <w:pPr>
+        <w:rPr>
+          <w:lang w:val="en-US"/>
+        </w:rPr>
+      </w:pPr>
+    </w:p>
+    <w:p>
+      <w:pPr>
+        <w:rPr>
+          <w:lang w:val="en-US"/>
+        </w:rPr>
+      </w:pPr>
+      <w:commentRangeStart w:id="9"/>
+      <w:r>
+        <w:rPr>
+          <w:lang w:val="en-US"/>
+        </w:rPr>
+        <w:t xml:space="preserve">Slide </w:t>
+      </w:r>
+      <w:commentRangeEnd w:id="9"/>
+      <w:r>
+        <w:rPr>
+          <w:rStyle w:val="CommentReference"/>
+          <w:sz w:val="24"/>
+          <w:szCs w:val="24"/>
+          <w:lang w:val="en-US"/>
+        </w:rPr>
+        <w:commentReference w:id="9"/>
+      </w:r>
+      <w:r>
+        <w:rPr>
+          <w:lang w:val="en-US"/>
+        </w:rPr>
+        <w:t>1</w:t>
+      </w:r>
+      <w:r>
+        <w:rPr>
+          <w:lang w:val="en-US"/>
+        </w:rPr>
+        <w:t>1</w:t>
       </w:r>
     </w:p>
     <w:p>
@@ -1119,302 +1751,6 @@
           <w:lang w:val="en-US"/>
         </w:rPr>
         <w:lastRenderedPageBreak/>
-        <w:t xml:space="preserve">Place · </w:t>
-      </w:r>
-      <w:r>
-        <w:rPr>
-          <w:lang w:val="en-US"/>
-        </w:rPr>
-        <w:t>G</w:t>
-      </w:r>
-      <w:r>
-        <w:rPr>
-          <w:lang w:val="en-US"/>
-        </w:rPr>
-        <w:t>eography, resources</w:t>
-      </w:r>
-      <w:r>
-        <w:rPr>
-          <w:lang w:val="en-US"/>
-        </w:rPr>
-        <w:t xml:space="preserve">, </w:t>
-      </w:r>
-      <w:r>
-        <w:rPr>
-          <w:lang w:val="en-US"/>
-        </w:rPr>
-        <w:t>natural disasters</w:t>
-      </w:r>
-    </w:p>
-    <w:p>
-      <w:pPr>
-        <w:ind w:firstLine="720"/>
-        <w:rPr>
-          <w:lang w:val="en-US"/>
-        </w:rPr>
-      </w:pPr>
-      <w:r>
-        <w:rPr>
-          <w:lang w:val="en-US"/>
-        </w:rPr>
-        <w:t>→ Why did people</w:t>
-      </w:r>
-      <w:r>
-        <w:rPr>
-          <w:lang w:val="en-US"/>
-        </w:rPr>
-        <w:t xml:space="preserve"> move here? What </w:t>
-      </w:r>
-      <w:r>
-        <w:rPr>
-          <w:lang w:val="en-US"/>
-        </w:rPr>
-        <w:t>resources did they want</w:t>
-      </w:r>
-      <w:r>
-        <w:rPr>
-          <w:lang w:val="en-US"/>
-        </w:rPr>
-        <w:t>?</w:t>
-      </w:r>
-    </w:p>
-    <w:p>
-      <w:pPr>
-        <w:rPr>
-          <w:lang w:val="en-US"/>
-        </w:rPr>
-      </w:pPr>
-      <w:r>
-        <w:rPr>
-          <w:lang w:val="en-US"/>
-        </w:rPr>
-        <w:t>Attitude</w:t>
-      </w:r>
-      <w:r>
-        <w:rPr>
-          <w:lang w:val="en-US"/>
-        </w:rPr>
-        <w:t>s</w:t>
-      </w:r>
-      <w:r>
-        <w:rPr>
-          <w:lang w:val="en-US"/>
-        </w:rPr>
-        <w:t xml:space="preserve"> · </w:t>
-      </w:r>
-      <w:r>
-        <w:rPr>
-          <w:lang w:val="en-US"/>
-        </w:rPr>
-        <w:t>C</w:t>
-      </w:r>
-      <w:r>
-        <w:rPr>
-          <w:lang w:val="en-US"/>
-        </w:rPr>
-        <w:t xml:space="preserve">ultural values, </w:t>
-      </w:r>
-      <w:r>
-        <w:rPr>
-          <w:lang w:val="en-US"/>
-        </w:rPr>
-        <w:t>I</w:t>
-      </w:r>
-      <w:r>
-        <w:rPr>
-          <w:lang w:val="en-US"/>
-        </w:rPr>
-        <w:t>mportant ideas</w:t>
-      </w:r>
-    </w:p>
-    <w:p>
-      <w:pPr>
-        <w:ind w:firstLine="720"/>
-        <w:rPr>
-          <w:lang w:val="en-US"/>
-        </w:rPr>
-      </w:pPr>
-      <w:r>
-        <w:rPr>
-          <w:lang w:val="en-US"/>
-        </w:rPr>
-        <w:t xml:space="preserve">→ What did people believe? </w:t>
-      </w:r>
-      <w:r>
-        <w:rPr>
-          <w:lang w:val="en-US"/>
-        </w:rPr>
-        <w:t>Were there changing ideas during the time?</w:t>
-      </w:r>
-    </w:p>
-    <w:p>
-      <w:pPr>
-        <w:rPr>
-          <w:lang w:val="en-US"/>
-        </w:rPr>
-      </w:pPr>
-      <w:r>
-        <w:rPr>
-          <w:lang w:val="en-US"/>
-        </w:rPr>
-        <w:t xml:space="preserve">Society · </w:t>
-      </w:r>
-      <w:r>
-        <w:rPr>
-          <w:lang w:val="en-US"/>
-        </w:rPr>
-        <w:t>S</w:t>
-      </w:r>
-      <w:r>
-        <w:rPr>
-          <w:lang w:val="en-US"/>
-        </w:rPr>
-        <w:t xml:space="preserve">ocial class, </w:t>
-      </w:r>
-      <w:r>
-        <w:rPr>
-          <w:lang w:val="en-US"/>
-        </w:rPr>
-        <w:t>P</w:t>
-      </w:r>
-      <w:r>
-        <w:rPr>
-          <w:lang w:val="en-US"/>
-        </w:rPr>
-        <w:t xml:space="preserve">olitics, </w:t>
-      </w:r>
-      <w:r>
-        <w:rPr>
-          <w:lang w:val="en-US"/>
-        </w:rPr>
-        <w:t>E</w:t>
-      </w:r>
-      <w:r>
-        <w:rPr>
-          <w:lang w:val="en-US"/>
-        </w:rPr>
-        <w:t>conomy</w:t>
-      </w:r>
-    </w:p>
-    <w:p>
-      <w:pPr>
-        <w:ind w:firstLine="720"/>
-        <w:rPr>
-          <w:lang w:val="en-US"/>
-        </w:rPr>
-      </w:pPr>
-      <w:r>
-        <w:rPr>
-          <w:lang w:val="en-US"/>
-        </w:rPr>
-        <w:t xml:space="preserve">→ Who held power? </w:t>
-      </w:r>
-      <w:r>
-        <w:rPr>
-          <w:lang w:val="en-US"/>
-        </w:rPr>
-        <w:t>How were the economic conditions?</w:t>
-      </w:r>
-    </w:p>
-    <w:p>
-      <w:pPr>
-        <w:rPr>
-          <w:lang w:val="en-US"/>
-        </w:rPr>
-      </w:pPr>
-      <w:r>
-        <w:rPr>
-          <w:lang w:val="en-US"/>
-        </w:rPr>
-        <w:t xml:space="preserve">Technology · </w:t>
-      </w:r>
-      <w:r>
-        <w:rPr>
-          <w:lang w:val="en-US"/>
-        </w:rPr>
-        <w:t xml:space="preserve">Important tools, Infrastructure, big </w:t>
-      </w:r>
-      <w:r>
-        <w:rPr>
-          <w:lang w:val="en-US"/>
-        </w:rPr>
-        <w:t>inventions</w:t>
-      </w:r>
-    </w:p>
-    <w:p>
-      <w:pPr>
-        <w:ind w:firstLine="720"/>
-        <w:rPr>
-          <w:lang w:val="en-US"/>
-        </w:rPr>
-      </w:pPr>
-      <w:r>
-        <w:rPr>
-          <w:lang w:val="en-US"/>
-        </w:rPr>
-        <w:t>→</w:t>
-      </w:r>
-      <w:r>
-        <w:rPr>
-          <w:lang w:val="en-US"/>
-        </w:rPr>
-        <w:t xml:space="preserve"> What was new</w:t>
-      </w:r>
-      <w:r>
-        <w:rPr>
-          <w:lang w:val="en-US"/>
-        </w:rPr>
-        <w:t>? How did it change daily life</w:t>
-      </w:r>
-      <w:r>
-        <w:rPr>
-          <w:lang w:val="en-US"/>
-        </w:rPr>
-        <w:t xml:space="preserve"> or business</w:t>
-      </w:r>
-      <w:r>
-        <w:rPr>
-          <w:lang w:val="en-US"/>
-        </w:rPr>
-        <w:t>?</w:t>
-      </w:r>
-    </w:p>
-    <w:p>
-      <w:pPr>
-        <w:rPr>
-          <w:lang w:val="en-US"/>
-        </w:rPr>
-      </w:pPr>
-    </w:p>
-    <w:p>
-      <w:pPr>
-        <w:rPr>
-          <w:lang w:val="en-US"/>
-        </w:rPr>
-      </w:pPr>
-      <w:r>
-        <w:rPr>
-          <w:lang w:val="en-US"/>
-        </w:rPr>
-        <w:t xml:space="preserve">Slide </w:t>
-      </w:r>
-      <w:r>
-        <w:rPr>
-          <w:lang w:val="en-US"/>
-        </w:rPr>
-        <w:t>12</w:t>
-      </w:r>
-    </w:p>
-    <w:p>
-      <w:pPr>
-        <w:rPr>
-          <w:lang w:val="en-US"/>
-        </w:rPr>
-      </w:pPr>
-      <w:r>
-        <w:rPr>
-          <w:lang w:val="en-US"/>
-        </w:rPr>
         <w:t>You think</w:t>
       </w:r>
       <w:r>
@@ -1427,7 +1763,56 @@
         <w:rPr>
           <w:lang w:val="en-US"/>
         </w:rPr>
-        <w:t>? [Yes – reveal line below]</w:t>
+        <w:t xml:space="preserve">? </w:t>
+      </w:r>
+    </w:p>
+    <w:p>
+      <w:pPr>
+        <w:rPr>
+          <w:lang w:val="en-US"/>
+        </w:rPr>
+      </w:pPr>
+      <w:r>
+        <w:rPr>
+          <w:lang w:val="en-US"/>
+        </w:rPr>
+        <w:t>(Add button for “</w:t>
+      </w:r>
+      <w:r>
+        <w:rPr>
+          <w:lang w:val="en-US"/>
+        </w:rPr>
+        <w:t>Yes</w:t>
+      </w:r>
+      <w:r>
+        <w:rPr>
+          <w:lang w:val="en-US"/>
+        </w:rPr>
+        <w:t>”</w:t>
+      </w:r>
+      <w:r>
+        <w:rPr>
+          <w:lang w:val="en-US"/>
+        </w:rPr>
+        <w:t xml:space="preserve"> </w:t>
+      </w:r>
+      <w:r>
+        <w:rPr>
+          <w:lang w:val="en-US"/>
+        </w:rPr>
+        <w:t>then</w:t>
+      </w:r>
+      <w:r>
+        <w:rPr>
+          <w:lang w:val="en-US"/>
+        </w:rPr>
+        <w:t xml:space="preserve"> reveal line below</w:t>
+      </w:r>
+      <w:r>
+        <w:rPr>
+          <w:lang w:val="en-US"/>
+        </w:rPr>
+        <w:t>)</w:t>
       </w:r>
     </w:p>
     <w:p>
@@ -1483,22 +1868,192 @@
         <w:rPr>
           <w:lang w:val="en-US"/>
         </w:rPr>
-        <w:t>[Button: Let’s Explore]</w:t>
-      </w:r>
-    </w:p>
-    <w:p>
-      <w:pPr>
-        <w:rPr>
-          <w:lang w:val="en-US"/>
-        </w:rPr>
-      </w:pPr>
-    </w:p>
-    <w:p>
-      <w:pPr>
-        <w:rPr>
-          <w:lang w:val="en-US"/>
-        </w:rPr>
-      </w:pPr>
+        <w:t xml:space="preserve">[Button: </w:t>
+      </w:r>
+      <w:r>
+        <w:rPr>
+          <w:lang w:val="en-US"/>
+        </w:rPr>
+        <w:t>Get Setup</w:t>
+      </w:r>
+      <w:r>
+        <w:rPr>
+          <w:lang w:val="en-US"/>
+        </w:rPr>
+        <w:t>]</w:t>
+      </w:r>
+    </w:p>
+    <w:p>
+      <w:pPr>
+        <w:rPr>
+          <w:lang w:val="en-US"/>
+        </w:rPr>
+      </w:pPr>
+    </w:p>
+    <w:p>
+      <w:pPr>
+        <w:rPr>
+          <w:lang w:val="en-US"/>
+        </w:rPr>
+      </w:pPr>
+      <w:r>
+        <w:rPr>
+          <w:lang w:val="en-US"/>
+        </w:rPr>
+        <w:t>For the setup, make the following edits:</w:t>
+      </w:r>
+    </w:p>
+    <w:p>
+      <w:pPr>
+        <w:rPr>
+          <w:lang w:val="en-US"/>
+        </w:rPr>
+      </w:pPr>
+      <w:r>
+        <w:rPr>
+          <w:lang w:val="en-US"/>
+        </w:rPr>
+        <w:t>Audio page stays the same</w:t>
+      </w:r>
+    </w:p>
+    <w:p>
+      <w:pPr>
+        <w:rPr>
+          <w:lang w:val="en-US"/>
+        </w:rPr>
+      </w:pPr>
+      <w:r>
+        <w:rPr>
+          <w:lang w:val="en-US"/>
+        </w:rPr>
+        <w:t xml:space="preserve">“Explore -&gt; contextualise -&gt; reflect” page entry text change to: “In this experience, you will be guided to…” and </w:t>
+      </w:r>
+      <w:r>
+        <w:rPr>
+          <w:lang w:val="en-US"/>
+        </w:rPr>
+        <w:t>get rid of the ending text “… to learn to think like a historian…” Under each large step, write the following: (1) for Explore – “Find stops and listen/read like a tour” (listen/read choose the verb based on what they chose in the audio setup); (2) for Contextualise – “Apply the P.A.S.T. and ask for more context”; (3) for Reflect “Share your thoughts!”</w:t>
+      </w:r>
+    </w:p>
+    <w:p>
+      <w:pPr>
+        <w:rPr>
+          <w:lang w:val="en-US"/>
+        </w:rPr>
+      </w:pPr>
+      <w:r>
+        <w:rPr>
+          <w:lang w:val="en-US"/>
+        </w:rPr>
+        <w:t>Find, walk, tap pin interaction is good, but instead of: “I’m here – explore this stop” button, say: “Let’s explore a real stop.”</w:t>
+      </w:r>
+    </w:p>
+    <w:p>
+      <w:pPr>
+        <w:rPr>
+          <w:lang w:val="en-US"/>
+        </w:rPr>
+      </w:pPr>
+      <w:r>
+        <w:rPr>
+          <w:lang w:val="en-US"/>
+        </w:rPr>
+        <w:t>Get rid of the Find and Discover screen as well as the “Ready to begin?” screen. Instead, after they tap “Let’s explore a real stop.” Fade into a dark screen</w:t>
+      </w:r>
+      <w:r>
+        <w:rPr>
+          <w:lang w:val="en-US"/>
+        </w:rPr>
+        <w:t xml:space="preserve">, have </w:t>
+      </w:r>
+      <w:r>
+        <w:rPr>
+          <w:lang w:val="en-US"/>
+        </w:rPr>
+        <w:t xml:space="preserve">Provenance logo </w:t>
+      </w:r>
+      <w:r>
+        <w:rPr>
+          <w:lang w:val="en-US"/>
+        </w:rPr>
+        <w:t xml:space="preserve">bounce in </w:t>
+      </w:r>
+      <w:r>
+        <w:rPr>
+          <w:lang w:val="en-US"/>
+        </w:rPr>
+        <w:t>and below say, in italics, “</w:t>
+      </w:r>
+      <w:r>
+        <w:rPr>
+          <w:lang w:val="en-US"/>
+        </w:rPr>
+        <w:t>Thank you for completing the</w:t>
+      </w:r>
+      <w:r>
+        <w:rPr>
+          <w:lang w:val="en-US"/>
+        </w:rPr>
+        <w:t xml:space="preserve"> onboard</w:t>
+      </w:r>
+      <w:r>
+        <w:rPr>
+          <w:lang w:val="en-US"/>
+        </w:rPr>
+        <w:t>ing</w:t>
+      </w:r>
+      <w:r>
+        <w:rPr>
+          <w:lang w:val="en-US"/>
+        </w:rPr>
+        <w:t xml:space="preserve"> and setup, </w:t>
+      </w:r>
+      <w:r>
+        <w:rPr>
+          <w:lang w:val="en-US"/>
+        </w:rPr>
+        <w:t>find a place to explore!”</w:t>
+      </w:r>
+      <w:r>
+        <w:rPr>
+          <w:lang w:val="en-US"/>
+        </w:rPr>
+        <w:t xml:space="preserve"> </w:t>
+      </w:r>
+    </w:p>
+    <w:p>
+      <w:pPr>
+        <w:rPr>
+          <w:lang w:val="en-US"/>
+        </w:rPr>
+      </w:pPr>
+    </w:p>
+    <w:p>
+      <w:pPr>
+        <w:rPr>
+          <w:lang w:val="en-US"/>
+        </w:rPr>
+      </w:pPr>
+      <w:r>
+        <w:rPr>
+          <w:lang w:val="en-US"/>
+        </w:rPr>
+        <w:br w:type="page"/>
+      </w:r>
+    </w:p>
+    <w:p>
+      <w:pPr>
+        <w:rPr>
+          <w:lang w:val="en-US"/>
+        </w:rPr>
+      </w:pPr>
+      <w:r>
+        <w:rPr>
+          <w:lang w:val="en-US"/>
+        </w:rPr>
+        <w:lastRenderedPageBreak/>
+        <w:t xml:space="preserve">CLAUDE IGNORE THE BELOW: </w:t>
+      </w:r>
     </w:p>
     <w:p>
       <w:pPr>
@@ -1571,24 +2126,6 @@
         <w:rPr>
           <w:lang w:val="en-US"/>
         </w:rPr>
-        <w:t>Let’s hear how would you reconstruct that world? What are you looking for? Voice dictation/written response</w:t>
-      </w:r>
-    </w:p>
-    <w:p>
-      <w:pPr>
-        <w:pStyle w:val="ListParagraph"/>
-        <w:numPr>
-          <w:ilvl w:val="0"/>
-          <w:numId w:val="1"/>
-        </w:numPr>
-        <w:rPr>
-          <w:lang w:val="en-US"/>
-        </w:rPr>
-      </w:pPr>
-      <w:r>
-        <w:rPr>
-          <w:lang w:val="en-US"/>
-        </w:rPr>
         <w:t>Thanks for sharing! Let’s compare to one way that historians do it… when historians reconstruct the world of the past, they are looking for context.</w:t>
       </w:r>
     </w:p>
@@ -1683,7 +2220,7 @@
         </w:rPr>
         <w:t xml:space="preserve">But those names, dates, events, and </w:t>
       </w:r>
-      <w:commentRangeStart w:id="6"/>
+      <w:commentRangeStart w:id="10"/>
       <w:r>
         <w:rPr>
           <w:strike/>
@@ -1691,7 +2228,7 @@
         </w:rPr>
         <w:t>stories are only part of the picture because it exists in a world we no longer live in.</w:t>
       </w:r>
-      <w:commentRangeEnd w:id="6"/>
+      <w:commentRangeEnd w:id="10"/>
       <w:r>
         <w:rPr>
           <w:rStyle w:val="CommentReference"/>
@@ -1700,7 +2237,7 @@
           <w:szCs w:val="24"/>
           <w:lang w:val="en-US"/>
         </w:rPr>
-        <w:commentReference w:id="6"/>
+        <w:commentReference w:id="10"/>
       </w:r>
       <w:r>
         <w:rPr>
@@ -1783,7 +2320,7 @@
 
 <file path=word/comments.xml><?xml version="1.0" encoding="utf-8"?>
 <w:comments xmlns:wpc="http://schemas.microsoft.com/office/word/2010/wordprocessingCanvas" xmlns:cx="http://schemas.microsoft.com/office/drawing/2014/chartex" xmlns:cx1="http://schemas.microsoft.com/office/drawing/2015/9/8/chartex" xmlns:cx2="http://schemas.microsoft.com/office/drawing/2015/10/21/chartex" xmlns:cx3="http://schemas.microsoft.com/office/drawing/2016/5/9/chartex" xmlns:cx4="http://schemas.microsoft.com/office/drawing/2016/5/10/chartex" xmlns:cx5="http://schemas.microsoft.com/office/drawing/2016/5/11/chartex" xmlns:cx6="http://schemas.microsoft.com/office/drawing/2016/5/12/chartex" xmlns:cx7="http://schemas.microsoft.com/office/drawing/2016/5/13/chartex" xmlns:cx8="http://schemas.microsoft.com/office/drawing/2016/5/14/chartex" xmlns:mc="http://schemas.openxmlformats.org/markup-compatibility/2006" xmlns:aink="http://schemas.microsoft.com/office/drawing/2016/ink" xmlns:am3d="http://schemas.microsoft.com/office/drawing/2017/model3d" xmlns:o="urn:schemas-microsoft-com:office:office" xmlns:oel="http://schemas.microsoft.com/office/2019/extlst" xmlns:r="http://schemas.openxmlformats.org/officeDocument/2006/relationships" xmlns:m="http://schemas.openxmlformats.org/officeDocument/2006/math" xmlns:v="urn:schemas-microsoft-com:vml" xmlns:wp14="http://schemas.microsoft.com/office/word/2010/wordprocessingDrawing" xmlns:wp="http://schemas.openxmlformats.org/drawingml/2006/wordprocessingDrawing" xmlns:w10="urn:schemas-microsoft-com:office:word" xmlns:w="http://schemas.openxmlformats.org/wordprocessingml/2006/main" xmlns:w14="http://schemas.microsoft.com/office/word/2010/wordml" xmlns:w15="http://schemas.microsoft.com/office/word/2012/wordml" xmlns:w16cex="http://schemas.microsoft.com/office/word/2018/wordml/cex" xmlns:w16cid="http://schemas.microsoft.com/office/word/2016/wordml/cid" xmlns:w16="http://schemas.microsoft.com/office/word/2018/wordml" xmlns:w16du="http://schemas.microsoft.com/office/word/2023/wordml/word16du" xmlns:w16sdtdh="http://schemas.microsoft.com/office/word/2020/wordml/sdtdatahash" xmlns:w16sdtfl="http://schemas.microsoft.com/office/word/2024/wordml/sdtformatlock" xmlns:w16se="http://schemas.microsoft.com/office/word/2015/wordml/symex" xmlns:wpg="http://schemas.microsoft.com/office/word/2010/wordprocessingGroup" xmlns:wpi="http://schemas.microsoft.com/office/word/2010/wordprocessingInk" xmlns:wne="http://schemas.microsoft.com/office/word/2006/wordml" xmlns:wps="http://schemas.microsoft.com/office/word/2010/wordprocessingShape" mc:Ignorable="w14 w15 w16se w16cid w16 w16cex w16sdtdh w16sdtfl w16du wp14">
-  <w:comment w:id="0" w:author="Sean Hu" w:date="2026-06-28T17:12:00Z" w:initials="SH">
+  <w:comment w:id="0" w:author="Sean Hu" w:date="2026-07-06T00:56:00Z" w:initials="SH">
     <w:p>
       <w:pPr>
         <w:pStyle w:val="CommentText"/>
@@ -1795,11 +2332,11 @@
         <w:annotationRef/>
       </w:r>
       <w:r>
-        <w:t>Possible multiple choice options?</w:t>
+        <w:t>Historical person, a date range, the person in an event</w:t>
       </w:r>
     </w:p>
   </w:comment>
-  <w:comment w:id="1" w:author="Sean Hu" w:date="2026-06-28T17:03:00Z" w:initials="SH">
+  <w:comment w:id="1" w:author="Sean Hu" w:date="2026-07-06T00:56:00Z" w:initials="SH">
     <w:p>
       <w:pPr>
         <w:pStyle w:val="CommentText"/>
@@ -1811,11 +2348,11 @@
         <w:annotationRef/>
       </w:r>
       <w:r>
-        <w:t>calendar</w:t>
+        <w:t>Put them together and make them move (in what looks like a fragment?)</w:t>
       </w:r>
     </w:p>
   </w:comment>
-  <w:comment w:id="2" w:author="Sean Hu" w:date="2026-06-28T17:03:00Z" w:initials="SH">
+  <w:comment w:id="2" w:author="Sean Hu" w:date="2026-07-05T22:32:00Z" w:initials="SH">
     <w:p>
       <w:pPr>
         <w:pStyle w:val="CommentText"/>
@@ -1827,11 +2364,24 @@
         <w:annotationRef/>
       </w:r>
       <w:r>
-        <w:t>Still of a battle</w:t>
+        <w:t>Missing fresco pieces, (put in puzzle interaction).</w:t>
+      </w:r>
+    </w:p>
+    <w:p>
+      <w:pPr>
+        <w:pStyle w:val="CommentText"/>
+      </w:pPr>
+    </w:p>
+    <w:p>
+      <w:pPr>
+        <w:pStyle w:val="CommentText"/>
+      </w:pPr>
+      <w:r>
+        <w:t>Two options… something that affirms image, something that changes meaning.</w:t>
       </w:r>
     </w:p>
   </w:comment>
-  <w:comment w:id="3" w:author="Sean Hu" w:date="2026-06-29T18:29:00Z" w:initials="SH">
+  <w:comment w:id="3" w:author="Sean Hu" w:date="2026-07-05T22:33:00Z" w:initials="SH">
     <w:p>
       <w:pPr>
         <w:pStyle w:val="CommentText"/>
@@ -1843,11 +2393,11 @@
         <w:annotationRef/>
       </w:r>
       <w:r>
-        <w:t>Missing fresco pieces, (put in puzzle interaction)</w:t>
+        <w:t>Maybe joan of arc-esque character. (1) rallying a crowd… (2) making a last stand</w:t>
       </w:r>
     </w:p>
   </w:comment>
-  <w:comment w:id="4" w:author="Sean Hu" w:date="2026-06-28T17:08:00Z" w:initials="SH">
+  <w:comment w:id="4" w:author="Sean Hu" w:date="2026-07-06T00:58:00Z" w:initials="SH">
     <w:p>
       <w:pPr>
         <w:pStyle w:val="CommentText"/>
@@ -1859,11 +2409,27 @@
         <w:annotationRef/>
       </w:r>
       <w:r>
+        <w:t>Once it’s combined, make it larger then have it fade away and have them try the other.</w:t>
+      </w:r>
+    </w:p>
+  </w:comment>
+  <w:comment w:id="5" w:author="Sean Hu [2]" w:date="2026-06-28T17:08:00Z" w:initials="SH">
+    <w:p>
+      <w:pPr>
+        <w:pStyle w:val="CommentText"/>
+      </w:pPr>
+      <w:r>
+        <w:rPr>
+          <w:rStyle w:val="CommentReference"/>
+        </w:rPr>
+        <w:annotationRef/>
+      </w:r>
+      <w:r>
         <w:t>Puzzle pieces of the animated church building coming together</w:t>
       </w:r>
     </w:p>
   </w:comment>
-  <w:comment w:id="5" w:author="Sean Hu" w:date="2026-06-29T18:23:00Z" w:initials="SH">
+  <w:comment w:id="6" w:author="Sean Hu" w:date="2026-07-05T22:44:00Z" w:initials="SH">
     <w:p>
       <w:pPr>
         <w:pStyle w:val="CommentText"/>
@@ -1875,11 +2441,59 @@
         <w:annotationRef/>
       </w:r>
       <w:r>
-        <w:t>Hide a word, blur it, tap it unveil (haptic response)</w:t>
+        <w:t>POTENTIALLY: Let’s hear how would you reconstruct that world? What are you looking for? Voice dictation/written response</w:t>
       </w:r>
     </w:p>
   </w:comment>
-  <w:comment w:id="6" w:author="Sean Hu" w:date="2026-06-28T17:06:00Z" w:initials="SH">
+  <w:comment w:id="7" w:author="Sean Hu" w:date="2026-07-06T01:01:00Z" w:initials="SH">
+    <w:p>
+      <w:pPr>
+        <w:pStyle w:val="CommentText"/>
+      </w:pPr>
+      <w:r>
+        <w:rPr>
+          <w:rStyle w:val="CommentReference"/>
+        </w:rPr>
+        <w:annotationRef/>
+      </w:r>
+      <w:r>
+        <w:t>Icon of a person thinking appearing after they tap the blurred answer?</w:t>
+      </w:r>
+    </w:p>
+  </w:comment>
+  <w:comment w:id="8" w:author="Sean Hu" w:date="2026-07-06T01:02:00Z" w:initials="SH">
+    <w:p>
+      <w:pPr>
+        <w:pStyle w:val="CommentText"/>
+      </w:pPr>
+      <w:r>
+        <w:rPr>
+          <w:rStyle w:val="CommentReference"/>
+        </w:rPr>
+        <w:annotationRef/>
+      </w:r>
+      <w:r>
+        <w:t>Animation of a blurred scene with a question mark with the question mark and blur fading into a clear scene</w:t>
+      </w:r>
+    </w:p>
+  </w:comment>
+  <w:comment w:id="9" w:author="Sean Hu" w:date="2026-07-02T00:49:00Z" w:initials="SH">
+    <w:p>
+      <w:pPr>
+        <w:pStyle w:val="CommentText"/>
+      </w:pPr>
+      <w:r>
+        <w:rPr>
+          <w:rStyle w:val="CommentReference"/>
+        </w:rPr>
+        <w:annotationRef/>
+      </w:r>
+      <w:r>
+        <w:t>Add before: Why is it important? More complete understanding of a place. See past what’s only presented in front of you-- see the full picture. CONNECT better to a place if you can see the world it belonged to. Connect this place with anothers. World does not exist in isolation. Help you be able to understand places better in the future. &lt;- long-term measurement</w:t>
+      </w:r>
+    </w:p>
+  </w:comment>
+  <w:comment w:id="10" w:author="Sean Hu [2]" w:date="2026-06-28T17:06:00Z" w:initials="SH">
     <w:p>
       <w:pPr>
         <w:pStyle w:val="CommentText"/>
@@ -1900,36 +2514,48 @@
 
 <file path=word/commentsExtended.xml><?xml version="1.0" encoding="utf-8"?>
 <w15:commentsEx xmlns:wpc="http://schemas.microsoft.com/office/word/2010/wordprocessingCanvas" xmlns:cx="http://schemas.microsoft.com/office/drawing/2014/chartex" xmlns:cx1="http://schemas.microsoft.com/office/drawing/2015/9/8/chartex" xmlns:cx2="http://schemas.microsoft.com/office/drawing/2015/10/21/chartex" xmlns:cx3="http://schemas.microsoft.com/office/drawing/2016/5/9/chartex" xmlns:cx4="http://schemas.microsoft.com/office/drawing/2016/5/10/chartex" xmlns:cx5="http://schemas.microsoft.com/office/drawing/2016/5/11/chartex" xmlns:cx6="http://schemas.microsoft.com/office/drawing/2016/5/12/chartex" xmlns:cx7="http://schemas.microsoft.com/office/drawing/2016/5/13/chartex" xmlns:cx8="http://schemas.microsoft.com/office/drawing/2016/5/14/chartex" xmlns:mc="http://schemas.openxmlformats.org/markup-compatibility/2006" xmlns:aink="http://schemas.microsoft.com/office/drawing/2016/ink" xmlns:am3d="http://schemas.microsoft.com/office/drawing/2017/model3d" xmlns:o="urn:schemas-microsoft-com:office:office" xmlns:oel="http://schemas.microsoft.com/office/2019/extlst" xmlns:r="http://schemas.openxmlformats.org/officeDocument/2006/relationships" xmlns:m="http://schemas.openxmlformats.org/officeDocument/2006/math" xmlns:v="urn:schemas-microsoft-com:vml" xmlns:wp14="http://schemas.microsoft.com/office/word/2010/wordprocessingDrawing" xmlns:wp="http://schemas.openxmlformats.org/drawingml/2006/wordprocessingDrawing" xmlns:w10="urn:schemas-microsoft-com:office:word" xmlns:w="http://schemas.openxmlformats.org/wordprocessingml/2006/main" xmlns:w14="http://schemas.microsoft.com/office/word/2010/wordml" xmlns:w15="http://schemas.microsoft.com/office/word/2012/wordml" xmlns:w16cex="http://schemas.microsoft.com/office/word/2018/wordml/cex" xmlns:w16cid="http://schemas.microsoft.com/office/word/2016/wordml/cid" xmlns:w16="http://schemas.microsoft.com/office/word/2018/wordml" xmlns:w16du="http://schemas.microsoft.com/office/word/2023/wordml/word16du" xmlns:w16sdtdh="http://schemas.microsoft.com/office/word/2020/wordml/sdtdatahash" xmlns:w16sdtfl="http://schemas.microsoft.com/office/word/2024/wordml/sdtformatlock" xmlns:w16se="http://schemas.microsoft.com/office/word/2015/wordml/symex" xmlns:wpg="http://schemas.microsoft.com/office/word/2010/wordprocessingGroup" xmlns:wpi="http://schemas.microsoft.com/office/word/2010/wordprocessingInk" xmlns:wne="http://schemas.microsoft.com/office/word/2006/wordml" xmlns:wps="http://schemas.microsoft.com/office/word/2010/wordprocessingShape" mc:Ignorable="w14 w15 w16se w16cid w16 w16cex w16sdtdh w16sdtfl w16du wp14">
-  <w15:commentEx w15:paraId="3F1F410B" w15:done="0"/>
-  <w15:commentEx w15:paraId="0A668E92" w15:done="0"/>
-  <w15:commentEx w15:paraId="44C619F7" w15:done="0"/>
-  <w15:commentEx w15:paraId="69F5A25E" w15:done="0"/>
+  <w15:commentEx w15:paraId="50736327" w15:done="0"/>
+  <w15:commentEx w15:paraId="78DC6E20" w15:done="0"/>
+  <w15:commentEx w15:paraId="4E1DDCB1" w15:done="0"/>
+  <w15:commentEx w15:paraId="5DAFE545" w15:paraIdParent="4E1DDCB1" w15:done="0"/>
+  <w15:commentEx w15:paraId="33579EF5" w15:paraIdParent="4E1DDCB1" w15:done="0"/>
   <w15:commentEx w15:paraId="20308E81" w15:done="0"/>
-  <w15:commentEx w15:paraId="4F2F7177" w15:done="0"/>
+  <w15:commentEx w15:paraId="1E43160F" w15:done="0"/>
+  <w15:commentEx w15:paraId="36B5C1A1" w15:done="0"/>
+  <w15:commentEx w15:paraId="75B40C04" w15:done="0"/>
+  <w15:commentEx w15:paraId="410A1BD5" w15:done="0"/>
   <w15:commentEx w15:paraId="435A5A57" w15:done="0"/>
 </w15:commentsEx>
 </file>
 
 <file path=word/commentsExtensible.xml><?xml version="1.0" encoding="utf-8"?>
 <w16cex:commentsExtensible xmlns:wpc="http://schemas.microsoft.com/office/word/2010/wordprocessingCanvas" xmlns:cx="http://schemas.microsoft.com/office/drawing/2014/chartex" xmlns:cx1="http://schemas.microsoft.com/office/drawing/2015/9/8/chartex" xmlns:cx2="http://schemas.microsoft.com/office/drawing/2015/10/21/chartex" xmlns:cx3="http://schemas.microsoft.com/office/drawing/2016/5/9/chartex" xmlns:cx4="http://schemas.microsoft.com/office/drawing/2016/5/10/chartex" xmlns:cx5="http://schemas.microsoft.com/office/drawing/2016/5/11/chartex" xmlns:cx6="http://schemas.microsoft.com/office/drawing/2016/5/12/chartex" xmlns:cx7="http://schemas.microsoft.com/office/drawing/2016/5/13/chartex" xmlns:cx8="http://schemas.microsoft.com/office/drawing/2016/5/14/chartex" xmlns:cr="http://schemas.microsoft.com/office/comments/2020/reactions" xmlns:mc="http://schemas.openxmlformats.org/markup-compatibility/2006" xmlns:aink="http://schemas.microsoft.com/office/drawing/2016/ink" xmlns:am3d="http://schemas.microsoft.com/office/drawing/2017/model3d" xmlns:o="urn:schemas-microsoft-com:office:office" xmlns:oel="http://schemas.microsoft.com/office/2019/extlst" xmlns:r="http://schemas.openxmlformats.org/officeDocument/2006/relationships" xmlns:m="http://schemas.openxmlformats.org/officeDocument/2006/math" xmlns:v="urn:schemas-microsoft-com:vml" xmlns:wp14="http://schemas.microsoft.com/office/word/2010/wordprocessingDrawing" xmlns:wp="http://schemas.openxmlformats.org/drawingml/2006/wordprocessingDrawing" xmlns:w10="urn:schemas-microsoft-com:office:word" xmlns:w="http://schemas.openxmlformats.org/wordprocessingml/2006/main" xmlns:w14="http://schemas.microsoft.com/office/word/2010/wordml" xmlns:w15="http://schemas.microsoft.com/office/word/2012/wordml" xmlns:w16cex="http://schemas.microsoft.com/office/word/2018/wordml/cex" xmlns:w16cid="http://schemas.microsoft.com/office/word/2016/wordml/cid" xmlns:w16="http://schemas.microsoft.com/office/word/2018/wordml" xmlns:w16du="http://schemas.microsoft.com/office/word/2023/wordml/word16du" xmlns:w16sdtdh="http://schemas.microsoft.com/office/word/2020/wordml/sdtdatahash" xmlns:w16sdtfl="http://schemas.microsoft.com/office/word/2024/wordml/sdtformatlock" xmlns:w16se="http://schemas.microsoft.com/office/word/2015/wordml/symex" xmlns:wpg="http://schemas.microsoft.com/office/word/2010/wordprocessingGroup" xmlns:wpi="http://schemas.microsoft.com/office/word/2010/wordprocessingInk" xmlns:wne="http://schemas.microsoft.com/office/word/2006/wordml" xmlns:wps="http://schemas.microsoft.com/office/word/2010/wordprocessingShape" mc:Ignorable="w14 w15 w16se w16cid w16 w16cex w16sdtdh w16sdtfl cr w16du wp14">
-  <w16cex:commentExtensible w16cex:durableId="1FE45E3C" w16cex:dateUtc="2026-06-29T00:12:00Z"/>
-  <w16cex:commentExtensible w16cex:durableId="31F82AD4" w16cex:dateUtc="2026-06-29T00:03:00Z"/>
-  <w16cex:commentExtensible w16cex:durableId="60453DC6" w16cex:dateUtc="2026-06-29T00:03:00Z"/>
-  <w16cex:commentExtensible w16cex:durableId="3BF8FB03" w16cex:dateUtc="2026-06-30T01:29:00Z"/>
+  <w16cex:commentExtensible w16cex:durableId="7EE4CAF9" w16cex:dateUtc="2026-07-06T07:56:00Z"/>
+  <w16cex:commentExtensible w16cex:durableId="7ED81B0E" w16cex:dateUtc="2026-07-06T07:56:00Z"/>
+  <w16cex:commentExtensible w16cex:durableId="211D560F" w16cex:dateUtc="2026-07-06T05:32:00Z"/>
+  <w16cex:commentExtensible w16cex:durableId="0F865ECE" w16cex:dateUtc="2026-07-06T05:33:00Z"/>
+  <w16cex:commentExtensible w16cex:durableId="6A444760" w16cex:dateUtc="2026-07-06T07:58:00Z"/>
   <w16cex:commentExtensible w16cex:durableId="58D3DC8B" w16cex:dateUtc="2026-06-29T00:08:00Z"/>
-  <w16cex:commentExtensible w16cex:durableId="6DE804AE" w16cex:dateUtc="2026-06-30T01:23:00Z"/>
+  <w16cex:commentExtensible w16cex:durableId="764E443C" w16cex:dateUtc="2026-07-06T05:44:00Z"/>
+  <w16cex:commentExtensible w16cex:durableId="435B53B6" w16cex:dateUtc="2026-07-06T08:01:00Z"/>
+  <w16cex:commentExtensible w16cex:durableId="7B9C5540" w16cex:dateUtc="2026-07-06T08:02:00Z"/>
+  <w16cex:commentExtensible w16cex:durableId="57846550" w16cex:dateUtc="2026-07-02T07:49:00Z"/>
   <w16cex:commentExtensible w16cex:durableId="0CB98FFE" w16cex:dateUtc="2026-06-29T00:06:00Z"/>
 </w16cex:commentsExtensible>
 </file>
 
 <file path=word/commentsIds.xml><?xml version="1.0" encoding="utf-8"?>
 <w16cid:commentsIds xmlns:wpc="http://schemas.microsoft.com/office/word/2010/wordprocessingCanvas" xmlns:cx="http://schemas.microsoft.com/office/drawing/2014/chartex" xmlns:cx1="http://schemas.microsoft.com/office/drawing/2015/9/8/chartex" xmlns:cx2="http://schemas.microsoft.com/office/drawing/2015/10/21/chartex" xmlns:cx3="http://schemas.microsoft.com/office/drawing/2016/5/9/chartex" xmlns:cx4="http://schemas.microsoft.com/office/drawing/2016/5/10/chartex" xmlns:cx5="http://schemas.microsoft.com/office/drawing/2016/5/11/chartex" xmlns:cx6="http://schemas.microsoft.com/office/drawing/2016/5/12/chartex" xmlns:cx7="http://schemas.microsoft.com/office/drawing/2016/5/13/chartex" xmlns:cx8="http://schemas.microsoft.com/office/drawing/2016/5/14/chartex" xmlns:mc="http://schemas.openxmlformats.org/markup-compatibility/2006" xmlns:aink="http://schemas.microsoft.com/office/drawing/2016/ink" xmlns:am3d="http://schemas.microsoft.com/office/drawing/2017/model3d" xmlns:o="urn:schemas-microsoft-com:office:office" xmlns:oel="http://schemas.microsoft.com/office/2019/extlst" xmlns:r="http://schemas.openxmlformats.org/officeDocument/2006/relationships" xmlns:m="http://schemas.openxmlformats.org/officeDocument/2006/math" xmlns:v="urn:schemas-microsoft-com:vml" xmlns:wp14="http://schemas.microsoft.com/office/word/2010/wordprocessingDrawing" xmlns:wp="http://schemas.openxmlformats.org/drawingml/2006/wordprocessingDrawing" xmlns:w10="urn:schemas-microsoft-com:office:word" xmlns:w="http://schemas.openxmlformats.org/wordprocessingml/2006/main" xmlns:w14="http://schemas.microsoft.com/office/word/2010/wordml" xmlns:w15="http://schemas.microsoft.com/office/word/2012/wordml" xmlns:w16cex="http://schemas.microsoft.com/office/word/2018/wordml/cex" xmlns:w16cid="http://schemas.microsoft.com/office/word/2016/wordml/cid" xmlns:w16="http://schemas.microsoft.com/office/word/2018/wordml" xmlns:w16du="http://schemas.microsoft.com/office/word/2023/wordml/word16du" xmlns:w16sdtdh="http://schemas.microsoft.com/office/word/2020/wordml/sdtdatahash" xmlns:w16sdtfl="http://schemas.microsoft.com/office/word/2024/wordml/sdtformatlock" xmlns:w16se="http://schemas.microsoft.com/office/word/2015/wordml/symex" xmlns:wpg="http://schemas.microsoft.com/office/word/2010/wordprocessingGroup" xmlns:wpi="http://schemas.microsoft.com/office/word/2010/wordprocessingInk" xmlns:wne="http://schemas.microsoft.com/office/word/2006/wordml" xmlns:wps="http://schemas.microsoft.com/office/word/2010/wordprocessingShape" mc:Ignorable="w14 w15 w16se w16cid w16 w16cex w16sdtdh w16sdtfl w16du wp14">
-  <w16cid:commentId w16cid:paraId="3F1F410B" w16cid:durableId="1FE45E3C"/>
-  <w16cid:commentId w16cid:paraId="0A668E92" w16cid:durableId="31F82AD4"/>
-  <w16cid:commentId w16cid:paraId="44C619F7" w16cid:durableId="60453DC6"/>
-  <w16cid:commentId w16cid:paraId="69F5A25E" w16cid:durableId="3BF8FB03"/>
+  <w16cid:commentId w16cid:paraId="50736327" w16cid:durableId="7EE4CAF9"/>
+  <w16cid:commentId w16cid:paraId="78DC6E20" w16cid:durableId="7ED81B0E"/>
+  <w16cid:commentId w16cid:paraId="4E1DDCB1" w16cid:durableId="211D560F"/>
+  <w16cid:commentId w16cid:paraId="5DAFE545" w16cid:durableId="0F865ECE"/>
+  <w16cid:commentId w16cid:paraId="33579EF5" w16cid:durableId="6A444760"/>
   <w16cid:commentId w16cid:paraId="20308E81" w16cid:durableId="58D3DC8B"/>
-  <w16cid:commentId w16cid:paraId="4F2F7177" w16cid:durableId="6DE804AE"/>
+  <w16cid:commentId w16cid:paraId="1E43160F" w16cid:durableId="764E443C"/>
+  <w16cid:commentId w16cid:paraId="36B5C1A1" w16cid:durableId="435B53B6"/>
+  <w16cid:commentId w16cid:paraId="75B40C04" w16cid:durableId="7B9C5540"/>
+  <w16cid:commentId w16cid:paraId="410A1BD5" w16cid:durableId="57846550"/>
   <w16cid:commentId w16cid:paraId="435A5A57" w16cid:durableId="0CB98FFE"/>
 </w16cid:commentsIds>
 </file>
@@ -1937,6 +2563,155 @@
 <file path=word/numbering.xml><?xml version="1.0" encoding="utf-8"?>
 <w:numbering xmlns:wpc="http://schemas.microsoft.com/office/word/2010/wordprocessingCanvas" xmlns:cx="http://schemas.microsoft.com/office/drawing/2014/chartex" xmlns:cx1="http://schemas.microsoft.com/office/drawing/2015/9/8/chartex" xmlns:cx2="http://schemas.microsoft.com/office/drawing/2015/10/21/chartex" xmlns:cx3="http://schemas.microsoft.com/office/drawing/2016/5/9/chartex" xmlns:cx4="http://schemas.microsoft.com/office/drawing/2016/5/10/chartex" xmlns:cx5="http://schemas.microsoft.com/office/drawing/2016/5/11/chartex" xmlns:cx6="http://schemas.microsoft.com/office/drawing/2016/5/12/chartex" xmlns:cx7="http://schemas.microsoft.com/office/drawing/2016/5/13/chartex" xmlns:cx8="http://schemas.microsoft.com/office/drawing/2016/5/14/chartex" xmlns:mc="http://schemas.openxmlformats.org/markup-compatibility/2006" xmlns:aink="http://schemas.microsoft.com/office/drawing/2016/ink" xmlns:am3d="http://schemas.microsoft.com/office/drawing/2017/model3d" xmlns:o="urn:schemas-microsoft-com:office:office" xmlns:oel="http://schemas.microsoft.com/office/2019/extlst" xmlns:r="http://schemas.openxmlformats.org/officeDocument/2006/relationships" xmlns:m="http://schemas.openxmlformats.org/officeDocument/2006/math" xmlns:v="urn:schemas-microsoft-com:vml" xmlns:wp14="http://schemas.microsoft.com/office/word/2010/wordprocessingDrawing" xmlns:wp="http://schemas.openxmlformats.org/drawingml/2006/wordprocessingDrawing" xmlns:w10="urn:schemas-microsoft-com:office:word" xmlns:w="http://schemas.openxmlformats.org/wordprocessingml/2006/main" xmlns:w14="http://schemas.microsoft.com/office/word/2010/wordml" xmlns:w15="http://schemas.microsoft.com/office/word/2012/wordml" xmlns:w16cex="http://schemas.microsoft.com/office/word/2018/wordml/cex" xmlns:w16cid="http://schemas.microsoft.com/office/word/2016/wordml/cid" xmlns:w16="http://schemas.microsoft.com/office/word/2018/wordml" xmlns:w16du="http://schemas.microsoft.com/office/word/2023/wordml/word16du" xmlns:w16sdtdh="http://schemas.microsoft.com/office/word/2020/wordml/sdtdatahash" xmlns:w16sdtfl="http://schemas.microsoft.com/office/word/2024/wordml/sdtformatlock" xmlns:w16se="http://schemas.microsoft.com/office/word/2015/wordml/symex" xmlns:wpg="http://schemas.microsoft.com/office/word/2010/wordprocessingGroup" xmlns:wpi="http://schemas.microsoft.com/office/word/2010/wordprocessingInk" xmlns:wne="http://schemas.microsoft.com/office/word/2006/wordml" xmlns:wps="http://schemas.microsoft.com/office/word/2010/wordprocessingShape" mc:Ignorable="w14 w15 w16se w16cid w16 w16cex w16sdtdh w16sdtfl w16du wp14">
   <w:abstractNum w:abstractNumId="0" w15:restartNumberingAfterBreak="0">
+    <w:nsid w:val="0DBA586B"/>
+    <w:multiLevelType w:val="multilevel"/>
+    <w:tmpl w:val="839EACEE"/>
+    <w:lvl w:ilvl="0">
+      <w:start w:val="1"/>
+      <w:numFmt w:val="bullet"/>
+      <w:lvlText w:val=""/>
+      <w:lvlJc w:val="left"/>
+      <w:pPr>
+        <w:tabs>
+          <w:tab w:val="num" w:pos="720"/>
+        </w:tabs>
+        <w:ind w:left="720" w:hanging="360"/>
+      </w:pPr>
+      <w:rPr>
+        <w:rFonts w:ascii="Symbol" w:hAnsi="Symbol" w:hint="default"/>
+        <w:sz w:val="20"/>
+      </w:rPr>
+    </w:lvl>
+    <w:lvl w:ilvl="1">
+      <w:start w:val="1"/>
+      <w:numFmt w:val="bullet"/>
+      <w:lvlText w:val="o"/>
+      <w:lvlJc w:val="left"/>
+      <w:pPr>
+        <w:tabs>
+          <w:tab w:val="num" w:pos="1440"/>
+        </w:tabs>
+        <w:ind w:left="1440" w:hanging="360"/>
+      </w:pPr>
+      <w:rPr>
+        <w:rFonts w:ascii="Courier New" w:hAnsi="Courier New" w:hint="default"/>
+        <w:sz w:val="20"/>
+      </w:rPr>
+    </w:lvl>
+    <w:lvl w:ilvl="2" w:tentative="1">
+      <w:start w:val="1"/>
+      <w:numFmt w:val="bullet"/>
+      <w:lvlText w:val=""/>
+      <w:lvlJc w:val="left"/>
+      <w:pPr>
+        <w:tabs>
+          <w:tab w:val="num" w:pos="2160"/>
+        </w:tabs>
+        <w:ind w:left="2160" w:hanging="360"/>
+      </w:pPr>
+      <w:rPr>
+        <w:rFonts w:ascii="Wingdings" w:hAnsi="Wingdings" w:hint="default"/>
+        <w:sz w:val="20"/>
+      </w:rPr>
+    </w:lvl>
+    <w:lvl w:ilvl="3" w:tentative="1">
+      <w:start w:val="1"/>
+      <w:numFmt w:val="bullet"/>
+      <w:lvlText w:val=""/>
+      <w:lvlJc w:val="left"/>
+      <w:pPr>
+        <w:tabs>
+          <w:tab w:val="num" w:pos="2880"/>
+        </w:tabs>
+        <w:ind w:left="2880" w:hanging="360"/>
+      </w:pPr>
+      <w:rPr>
+        <w:rFonts w:ascii="Wingdings" w:hAnsi="Wingdings" w:hint="default"/>
+        <w:sz w:val="20"/>
+      </w:rPr>
+    </w:lvl>
+    <w:lvl w:ilvl="4" w:tentative="1">
+      <w:start w:val="1"/>
+      <w:numFmt w:val="bullet"/>
+      <w:lvlText w:val=""/>
+      <w:lvlJc w:val="left"/>
+      <w:pPr>
+        <w:tabs>
+          <w:tab w:val="num" w:pos="3600"/>
+        </w:tabs>
+        <w:ind w:left="3600" w:hanging="360"/>
+      </w:pPr>
+      <w:rPr>
+        <w:rFonts w:ascii="Wingdings" w:hAnsi="Wingdings" w:hint="default"/>
+        <w:sz w:val="20"/>
+      </w:rPr>
+    </w:lvl>
+    <w:lvl w:ilvl="5" w:tentative="1">
+      <w:start w:val="1"/>
+      <w:numFmt w:val="bullet"/>
+      <w:lvlText w:val=""/>
+      <w:lvlJc w:val="left"/>
+      <w:pPr>
+        <w:tabs>
+          <w:tab w:val="num" w:pos="4320"/>
+        </w:tabs>
+        <w:ind w:left="4320" w:hanging="360"/>
+      </w:pPr>
+      <w:rPr>
+        <w:rFonts w:ascii="Wingdings" w:hAnsi="Wingdings" w:hint="default"/>
+        <w:sz w:val="20"/>
+      </w:rPr>
+    </w:lvl>
+    <w:lvl w:ilvl="6" w:tentative="1">
+      <w:start w:val="1"/>
+      <w:numFmt w:val="bullet"/>
+      <w:lvlText w:val=""/>
+      <w:lvlJc w:val="left"/>
+      <w:pPr>
+        <w:tabs>
+          <w:tab w:val="num" w:pos="5040"/>
+        </w:tabs>
+        <w:ind w:left="5040" w:hanging="360"/>
+      </w:pPr>
+      <w:rPr>
+        <w:rFonts w:ascii="Wingdings" w:hAnsi="Wingdings" w:hint="default"/>
+        <w:sz w:val="20"/>
+      </w:rPr>
+    </w:lvl>
+    <w:lvl w:ilvl="7" w:tentative="1">
+      <w:start w:val="1"/>
+      <w:numFmt w:val="bullet"/>
+      <w:lvlText w:val=""/>
+      <w:lvlJc w:val="left"/>
+      <w:pPr>
+        <w:tabs>
+          <w:tab w:val="num" w:pos="5760"/>
+        </w:tabs>
+        <w:ind w:left="5760" w:hanging="360"/>
+      </w:pPr>
+      <w:rPr>
+        <w:rFonts w:ascii="Wingdings" w:hAnsi="Wingdings" w:hint="default"/>
+        <w:sz w:val="20"/>
+      </w:rPr>
+    </w:lvl>
+    <w:lvl w:ilvl="8" w:tentative="1">
+      <w:start w:val="1"/>
+      <w:numFmt w:val="bullet"/>
+      <w:lvlText w:val=""/>
+      <w:lvlJc w:val="left"/>
+      <w:pPr>
+        <w:tabs>
+          <w:tab w:val="num" w:pos="6480"/>
+        </w:tabs>
+        <w:ind w:left="6480" w:hanging="360"/>
+      </w:pPr>
+      <w:rPr>
+        <w:rFonts w:ascii="Wingdings" w:hAnsi="Wingdings" w:hint="default"/>
+        <w:sz w:val="20"/>
+      </w:rPr>
+    </w:lvl>
+  </w:abstractNum>
+  <w:abstractNum w:abstractNumId="1" w15:restartNumberingAfterBreak="0">
     <w:nsid w:val="332145F9"/>
     <w:multiLevelType w:val="hybridMultilevel"/>
     <w:tmpl w:val="6A90A8BA"/>
@@ -2048,7 +2823,7 @@
       </w:rPr>
     </w:lvl>
   </w:abstractNum>
-  <w:abstractNum w:abstractNumId="1" w15:restartNumberingAfterBreak="0">
+  <w:abstractNum w:abstractNumId="2" w15:restartNumberingAfterBreak="0">
     <w:nsid w:val="4ACA5DCD"/>
     <w:multiLevelType w:val="hybridMultilevel"/>
     <w:tmpl w:val="C65A1994"/>
@@ -2160,7 +2935,7 @@
       </w:rPr>
     </w:lvl>
   </w:abstractNum>
-  <w:abstractNum w:abstractNumId="2" w15:restartNumberingAfterBreak="0">
+  <w:abstractNum w:abstractNumId="3" w15:restartNumberingAfterBreak="0">
     <w:nsid w:val="51EB7E50"/>
     <w:multiLevelType w:val="hybridMultilevel"/>
     <w:tmpl w:val="324270BE"/>
@@ -2273,13 +3048,96 @@
     </w:lvl>
   </w:abstractNum>
   <w:num w:numId="1" w16cid:durableId="47611286">
+    <w:abstractNumId w:val="1"/>
+  </w:num>
+  <w:num w:numId="2" w16cid:durableId="239599705">
+    <w:abstractNumId w:val="3"/>
+  </w:num>
+  <w:num w:numId="3" w16cid:durableId="49574795">
+    <w:abstractNumId w:val="2"/>
+  </w:num>
+  <w:num w:numId="4" w16cid:durableId="1291132985">
     <w:abstractNumId w:val="0"/>
   </w:num>
-  <w:num w:numId="2" w16cid:durableId="239599705">
-    <w:abstractNumId w:val="2"/>
+  <w:num w:numId="5" w16cid:durableId="156697385">
+    <w:abstractNumId w:val="0"/>
+    <w:lvlOverride w:ilvl="1">
+      <w:lvl w:ilvl="1">
+        <w:numFmt w:val="bullet"/>
+        <w:lvlText w:val=""/>
+        <w:lvlJc w:val="left"/>
+        <w:pPr>
+          <w:tabs>
+            <w:tab w:val="num" w:pos="1440"/>
+          </w:tabs>
+          <w:ind w:left="1440" w:hanging="360"/>
+        </w:pPr>
+        <w:rPr>
+          <w:rFonts w:ascii="Symbol" w:hAnsi="Symbol" w:hint="default"/>
+          <w:sz w:val="20"/>
+        </w:rPr>
+      </w:lvl>
+    </w:lvlOverride>
   </w:num>
-  <w:num w:numId="3" w16cid:durableId="49574795">
-    <w:abstractNumId w:val="1"/>
+  <w:num w:numId="6" w16cid:durableId="1539463203">
+    <w:abstractNumId w:val="0"/>
+    <w:lvlOverride w:ilvl="1">
+      <w:lvl w:ilvl="1">
+        <w:numFmt w:val="bullet"/>
+        <w:lvlText w:val=""/>
+        <w:lvlJc w:val="left"/>
+        <w:pPr>
+          <w:tabs>
+            <w:tab w:val="num" w:pos="1440"/>
+          </w:tabs>
+          <w:ind w:left="1440" w:hanging="360"/>
+        </w:pPr>
+        <w:rPr>
+          <w:rFonts w:ascii="Symbol" w:hAnsi="Symbol" w:hint="default"/>
+          <w:sz w:val="20"/>
+        </w:rPr>
+      </w:lvl>
+    </w:lvlOverride>
+  </w:num>
+  <w:num w:numId="7" w16cid:durableId="1103498801">
+    <w:abstractNumId w:val="0"/>
+    <w:lvlOverride w:ilvl="1">
+      <w:lvl w:ilvl="1">
+        <w:numFmt w:val="bullet"/>
+        <w:lvlText w:val=""/>
+        <w:lvlJc w:val="left"/>
+        <w:pPr>
+          <w:tabs>
+            <w:tab w:val="num" w:pos="1440"/>
+          </w:tabs>
+          <w:ind w:left="1440" w:hanging="360"/>
+        </w:pPr>
+        <w:rPr>
+          <w:rFonts w:ascii="Symbol" w:hAnsi="Symbol" w:hint="default"/>
+          <w:sz w:val="20"/>
+        </w:rPr>
+      </w:lvl>
+    </w:lvlOverride>
+  </w:num>
+  <w:num w:numId="8" w16cid:durableId="1469319195">
+    <w:abstractNumId w:val="0"/>
+    <w:lvlOverride w:ilvl="1">
+      <w:lvl w:ilvl="1">
+        <w:numFmt w:val="bullet"/>
+        <w:lvlText w:val=""/>
+        <w:lvlJc w:val="left"/>
+        <w:pPr>
+          <w:tabs>
+            <w:tab w:val="num" w:pos="1440"/>
+          </w:tabs>
+          <w:ind w:left="1440" w:hanging="360"/>
+        </w:pPr>
+        <w:rPr>
+          <w:rFonts w:ascii="Symbol" w:hAnsi="Symbol" w:hint="default"/>
+          <w:sz w:val="20"/>
+        </w:rPr>
+      </w:lvl>
+    </w:lvlOverride>
   </w:num>
 </w:numbering>
 </file>
@@ -2287,6 +3145,9 @@
 <file path=word/people.xml><?xml version="1.0" encoding="utf-8"?>
 <w15:people xmlns:wpc="http://schemas.microsoft.com/office/word/2010/wordprocessingCanvas" xmlns:cx="http://schemas.microsoft.com/office/drawing/2014/chartex" xmlns:cx1="http://schemas.microsoft.com/office/drawing/2015/9/8/chartex" xmlns:cx2="http://schemas.microsoft.com/office/drawing/2015/10/21/chartex" xmlns:cx3="http://schemas.microsoft.com/office/drawing/2016/5/9/chartex" xmlns:cx4="http://schemas.microsoft.com/office/drawing/2016/5/10/chartex" xmlns:cx5="http://schemas.microsoft.com/office/drawing/2016/5/11/chartex" xmlns:cx6="http://schemas.microsoft.com/office/drawing/2016/5/12/chartex" xmlns:cx7="http://schemas.microsoft.com/office/drawing/2016/5/13/chartex" xmlns:cx8="http://schemas.microsoft.com/office/drawing/2016/5/14/chartex" xmlns:mc="http://schemas.openxmlformats.org/markup-compatibility/2006" xmlns:aink="http://schemas.microsoft.com/office/drawing/2016/ink" xmlns:am3d="http://schemas.microsoft.com/office/drawing/2017/model3d" xmlns:o="urn:schemas-microsoft-com:office:office" xmlns:oel="http://schemas.microsoft.com/office/2019/extlst" xmlns:r="http://schemas.openxmlformats.org/officeDocument/2006/relationships" xmlns:m="http://schemas.openxmlformats.org/officeDocument/2006/math" xmlns:v="urn:schemas-microsoft-com:vml" xmlns:wp14="http://schemas.microsoft.com/office/word/2010/wordprocessingDrawing" xmlns:wp="http://schemas.openxmlformats.org/drawingml/2006/wordprocessingDrawing" xmlns:w10="urn:schemas-microsoft-com:office:word" xmlns:w="http://schemas.openxmlformats.org/wordprocessingml/2006/main" xmlns:w14="http://schemas.microsoft.com/office/word/2010/wordml" xmlns:w15="http://schemas.microsoft.com/office/word/2012/wordml" xmlns:w16cex="http://schemas.microsoft.com/office/word/2018/wordml/cex" xmlns:w16cid="http://schemas.microsoft.com/office/word/2016/wordml/cid" xmlns:w16="http://schemas.microsoft.com/office/word/2018/wordml" xmlns:w16du="http://schemas.microsoft.com/office/word/2023/wordml/word16du" xmlns:w16sdtdh="http://schemas.microsoft.com/office/word/2020/wordml/sdtdatahash" xmlns:w16sdtfl="http://schemas.microsoft.com/office/word/2024/wordml/sdtformatlock" xmlns:w16se="http://schemas.microsoft.com/office/word/2015/wordml/symex" xmlns:wpg="http://schemas.microsoft.com/office/word/2010/wordprocessingGroup" xmlns:wpi="http://schemas.microsoft.com/office/word/2010/wordprocessingInk" xmlns:wne="http://schemas.microsoft.com/office/word/2006/wordml" xmlns:wps="http://schemas.microsoft.com/office/word/2010/wordprocessingShape" mc:Ignorable="w14 w15 w16se w16cid w16 w16cex w16sdtdh w16sdtfl w16du wp14">
   <w15:person w15:author="Sean Hu">
+    <w15:presenceInfo w15:providerId="Windows Live" w15:userId="0f3e0b09dd822909"/>
+  </w15:person>
+  <w15:person w15:author="Sean Hu [2]">
     <w15:presenceInfo w15:providerId="Windows Live" w15:userId="9a29247a2c6afbe1"/>
   </w15:person>
 </w15:people>
@@ -2898,7 +3759,6 @@
   <w:style w:type="character" w:default="1" w:styleId="DefaultParagraphFont">
     <w:name w:val="Default Paragraph Font"/>
     <w:uiPriority w:val="1"/>
-    <w:semiHidden/>
     <w:unhideWhenUsed/>
   </w:style>
   <w:style w:type="table" w:default="1" w:styleId="TableNormal">

</xml_diff>